<commit_message>
chore: remove CommentThread and comments API routes (replaced by AgentChat)
</commit_message>
<xml_diff>
--- a/docs/processos/8.1 - Integrações Oracle/documentacao-gerada/8.1 - Integrações Oracle.docx
+++ b/docs/processos/8.1 - Integrações Oracle/documentacao-gerada/8.1 - Integrações Oracle.docx
@@ -281,7 +281,7 @@
                 <w:color w:val="515151"/>
                 <w:sz w:val="20"/>
               </w:rPr>
-              <w:t>1.0</w:t>
+              <w:t>2.0</w:t>
             </w:r>
           </w:p>
         </w:tc>
@@ -1111,6 +1111,372 @@
           <w:color w:val="0C0E0E"/>
           <w:sz w:val="22"/>
         </w:rPr>
+        <w:t>Regra 6 — Serviços com valor fixo (sem split por módulo)</w:t>
+      </w:r>
+    </w:p>
+    <w:p>
+      <w:pPr>
+        <w:ind w:left="432"/>
+      </w:pPr>
+      <w:r>
+        <w:rPr>
+          <w:rFonts w:ascii="Lato" w:hAnsi="Lato"/>
+          <w:b w:val="0"/>
+          <w:i w:val="0"/>
+          <w:color w:val="515151"/>
+          <w:sz w:val="21"/>
+        </w:rPr>
+        <w:t>Os seguintes serviços não passam por split proporcional — recebem o valor diretamente do prog_qtd correspondente:</w:t>
+      </w:r>
+    </w:p>
+    <w:tbl>
+      <w:tblPr>
+        <w:tblW w:type="auto" w:w="0"/>
+        <w:tblLook w:firstColumn="1" w:firstRow="1" w:lastColumn="0" w:lastRow="0" w:noHBand="0" w:noVBand="1" w:val="04A0"/>
+      </w:tblPr>
+      <w:tblGrid>
+        <w:gridCol w:w="4561"/>
+        <w:gridCol w:w="4561"/>
+      </w:tblGrid>
+      <w:tr>
+        <w:trPr>
+          <w:cantSplit/>
+        </w:trPr>
+        <w:tc>
+          <w:tcPr>
+            <w:tcW w:type="dxa" w:w="5669"/>
+            <w:shd w:val="clear" w:color="auto" w:fill="0C0E0E"/>
+            <w:vAlign w:val="center"/>
+          </w:tcPr>
+          <w:p>
+            <w:r>
+              <w:rPr>
+                <w:rFonts w:ascii="Lato" w:hAnsi="Lato"/>
+                <w:b/>
+                <w:color w:val="FFFFFF"/>
+                <w:sz w:val="20"/>
+              </w:rPr>
+              <w:t>Serviço HubSpot</w:t>
+            </w:r>
+          </w:p>
+        </w:tc>
+        <w:tc>
+          <w:tcPr>
+            <w:tcW w:type="dxa" w:w="4535"/>
+            <w:shd w:val="clear" w:color="auto" w:fill="0C0E0E"/>
+            <w:vAlign w:val="center"/>
+          </w:tcPr>
+          <w:p>
+            <w:r>
+              <w:rPr>
+                <w:rFonts w:ascii="Lato" w:hAnsi="Lato"/>
+                <w:b/>
+                <w:color w:val="FFFFFF"/>
+                <w:sz w:val="20"/>
+              </w:rPr>
+              <w:t>Propriedade Oracle utilizada</w:t>
+            </w:r>
+          </w:p>
+        </w:tc>
+      </w:tr>
+      <w:tr>
+        <w:trPr>
+          <w:cantSplit/>
+        </w:trPr>
+        <w:tc>
+          <w:tcPr>
+            <w:tcW w:type="dxa" w:w="5669"/>
+            <w:shd w:val="clear" w:color="auto" w:fill="FFFFFF"/>
+            <w:vAlign w:val="center"/>
+          </w:tcPr>
+          <w:p>
+            <w:r>
+              <w:rPr>
+                <w:rFonts w:ascii="Lato" w:hAnsi="Lato"/>
+                <w:b w:val="0"/>
+                <w:color w:val="515151"/>
+                <w:sz w:val="20"/>
+              </w:rPr>
+              <w:t>APIs (Start/Essencial/Special/Ultimate/Enterprise)</w:t>
+            </w:r>
+          </w:p>
+        </w:tc>
+        <w:tc>
+          <w:tcPr>
+            <w:tcW w:type="dxa" w:w="4535"/>
+            <w:shd w:val="clear" w:color="auto" w:fill="FFFFFF"/>
+            <w:vAlign w:val="center"/>
+          </w:tcPr>
+          <w:p>
+            <w:r>
+              <w:rPr>
+                <w:rFonts w:ascii="Lato" w:hAnsi="Lato"/>
+                <w:b w:val="0"/>
+                <w:color w:val="515151"/>
+                <w:sz w:val="20"/>
+              </w:rPr>
+              <w:t>prog_qtd_apis</w:t>
+            </w:r>
+          </w:p>
+        </w:tc>
+      </w:tr>
+      <w:tr>
+        <w:trPr>
+          <w:cantSplit/>
+        </w:trPr>
+        <w:tc>
+          <w:tcPr>
+            <w:tcW w:type="dxa" w:w="5669"/>
+            <w:shd w:val="clear" w:color="auto" w:fill="F5F5F5"/>
+            <w:vAlign w:val="center"/>
+          </w:tcPr>
+          <w:p>
+            <w:r>
+              <w:rPr>
+                <w:rFonts w:ascii="Lato" w:hAnsi="Lato"/>
+                <w:b w:val="0"/>
+                <w:color w:val="515151"/>
+                <w:sz w:val="20"/>
+              </w:rPr>
+              <w:t>NFe / NFE até 9 usuários / NFE acima de 10 usuários</w:t>
+            </w:r>
+          </w:p>
+        </w:tc>
+        <w:tc>
+          <w:tcPr>
+            <w:tcW w:type="dxa" w:w="4535"/>
+            <w:shd w:val="clear" w:color="auto" w:fill="F5F5F5"/>
+            <w:vAlign w:val="center"/>
+          </w:tcPr>
+          <w:p>
+            <w:r>
+              <w:rPr>
+                <w:rFonts w:ascii="Lato" w:hAnsi="Lato"/>
+                <w:b w:val="0"/>
+                <w:color w:val="515151"/>
+                <w:sz w:val="20"/>
+              </w:rPr>
+              <w:t>prog_qtd_nota_fiscal_eletronica</w:t>
+            </w:r>
+          </w:p>
+        </w:tc>
+      </w:tr>
+      <w:tr>
+        <w:trPr>
+          <w:cantSplit/>
+        </w:trPr>
+        <w:tc>
+          <w:tcPr>
+            <w:tcW w:type="dxa" w:w="5669"/>
+            <w:shd w:val="clear" w:color="auto" w:fill="FFFFFF"/>
+            <w:vAlign w:val="center"/>
+          </w:tcPr>
+          <w:p>
+            <w:r>
+              <w:rPr>
+                <w:rFonts w:ascii="Lato" w:hAnsi="Lato"/>
+                <w:b w:val="0"/>
+                <w:color w:val="515151"/>
+                <w:sz w:val="20"/>
+              </w:rPr>
+              <w:t>NFs (Nota Fiscal de Serviço)</w:t>
+            </w:r>
+          </w:p>
+        </w:tc>
+        <w:tc>
+          <w:tcPr>
+            <w:tcW w:type="dxa" w:w="4535"/>
+            <w:shd w:val="clear" w:color="auto" w:fill="FFFFFF"/>
+            <w:vAlign w:val="center"/>
+          </w:tcPr>
+          <w:p>
+            <w:r>
+              <w:rPr>
+                <w:rFonts w:ascii="Lato" w:hAnsi="Lato"/>
+                <w:b w:val="0"/>
+                <w:color w:val="515151"/>
+                <w:sz w:val="20"/>
+              </w:rPr>
+              <w:t>prog_qtd_nota_fiscal_de_servico</w:t>
+            </w:r>
+          </w:p>
+        </w:tc>
+      </w:tr>
+      <w:tr>
+        <w:trPr>
+          <w:cantSplit/>
+        </w:trPr>
+        <w:tc>
+          <w:tcPr>
+            <w:tcW w:type="dxa" w:w="5669"/>
+            <w:shd w:val="clear" w:color="auto" w:fill="F5F5F5"/>
+            <w:vAlign w:val="center"/>
+          </w:tcPr>
+          <w:p>
+            <w:r>
+              <w:rPr>
+                <w:rFonts w:ascii="Lato" w:hAnsi="Lato"/>
+                <w:b w:val="0"/>
+                <w:color w:val="515151"/>
+                <w:sz w:val="20"/>
+              </w:rPr>
+              <w:t>Recepção de CTe</w:t>
+            </w:r>
+          </w:p>
+        </w:tc>
+        <w:tc>
+          <w:tcPr>
+            <w:tcW w:type="dxa" w:w="4535"/>
+            <w:shd w:val="clear" w:color="auto" w:fill="F5F5F5"/>
+            <w:vAlign w:val="center"/>
+          </w:tcPr>
+          <w:p>
+            <w:r>
+              <w:rPr>
+                <w:rFonts w:ascii="Lato" w:hAnsi="Lato"/>
+                <w:b w:val="0"/>
+                <w:color w:val="515151"/>
+                <w:sz w:val="20"/>
+              </w:rPr>
+              <w:t>prog_qtd_emissao_de_conhecimento_de_transporte_eletronico_cte</w:t>
+            </w:r>
+          </w:p>
+        </w:tc>
+      </w:tr>
+      <w:tr>
+        <w:trPr>
+          <w:cantSplit/>
+        </w:trPr>
+        <w:tc>
+          <w:tcPr>
+            <w:tcW w:type="dxa" w:w="5669"/>
+            <w:shd w:val="clear" w:color="auto" w:fill="FFFFFF"/>
+            <w:vAlign w:val="center"/>
+          </w:tcPr>
+          <w:p>
+            <w:r>
+              <w:rPr>
+                <w:rFonts w:ascii="Lato" w:hAnsi="Lato"/>
+                <w:b w:val="0"/>
+                <w:color w:val="515151"/>
+                <w:sz w:val="20"/>
+              </w:rPr>
+              <w:t>Base Teste (Sem/Com Anexo, Custo fixo)</w:t>
+            </w:r>
+          </w:p>
+        </w:tc>
+        <w:tc>
+          <w:tcPr>
+            <w:tcW w:type="dxa" w:w="4535"/>
+            <w:shd w:val="clear" w:color="auto" w:fill="FFFFFF"/>
+            <w:vAlign w:val="center"/>
+          </w:tcPr>
+          <w:p>
+            <w:r>
+              <w:rPr>
+                <w:rFonts w:ascii="Lato" w:hAnsi="Lato"/>
+                <w:b w:val="0"/>
+                <w:color w:val="515151"/>
+                <w:sz w:val="20"/>
+              </w:rPr>
+              <w:t>prog_qtd_base_de_testes</w:t>
+            </w:r>
+          </w:p>
+        </w:tc>
+      </w:tr>
+      <w:tr>
+        <w:trPr>
+          <w:cantSplit/>
+        </w:trPr>
+        <w:tc>
+          <w:tcPr>
+            <w:tcW w:type="dxa" w:w="5669"/>
+            <w:shd w:val="clear" w:color="auto" w:fill="F5F5F5"/>
+            <w:vAlign w:val="center"/>
+          </w:tcPr>
+          <w:p>
+            <w:r>
+              <w:rPr>
+                <w:rFonts w:ascii="Lato" w:hAnsi="Lato"/>
+                <w:b w:val="0"/>
+                <w:color w:val="515151"/>
+                <w:sz w:val="20"/>
+              </w:rPr>
+              <w:t>E-Custos</w:t>
+            </w:r>
+          </w:p>
+        </w:tc>
+        <w:tc>
+          <w:tcPr>
+            <w:tcW w:type="dxa" w:w="4535"/>
+            <w:shd w:val="clear" w:color="auto" w:fill="F5F5F5"/>
+            <w:vAlign w:val="center"/>
+          </w:tcPr>
+          <w:p>
+            <w:r>
+              <w:rPr>
+                <w:rFonts w:ascii="Lato" w:hAnsi="Lato"/>
+                <w:b w:val="0"/>
+                <w:color w:val="515151"/>
+                <w:sz w:val="20"/>
+              </w:rPr>
+              <w:t>prog_qtd_ecustos_integracao</w:t>
+            </w:r>
+          </w:p>
+        </w:tc>
+      </w:tr>
+      <w:tr>
+        <w:trPr>
+          <w:cantSplit/>
+        </w:trPr>
+        <w:tc>
+          <w:tcPr>
+            <w:tcW w:type="dxa" w:w="5669"/>
+            <w:shd w:val="clear" w:color="auto" w:fill="FFFFFF"/>
+            <w:vAlign w:val="center"/>
+          </w:tcPr>
+          <w:p>
+            <w:r>
+              <w:rPr>
+                <w:rFonts w:ascii="Lato" w:hAnsi="Lato"/>
+                <w:b w:val="0"/>
+                <w:color w:val="515151"/>
+                <w:sz w:val="20"/>
+              </w:rPr>
+              <w:t>Data Center LU</w:t>
+            </w:r>
+          </w:p>
+        </w:tc>
+        <w:tc>
+          <w:tcPr>
+            <w:tcW w:type="dxa" w:w="4535"/>
+            <w:shd w:val="clear" w:color="auto" w:fill="FFFFFF"/>
+            <w:vAlign w:val="center"/>
+          </w:tcPr>
+          <w:p>
+            <w:r>
+              <w:rPr>
+                <w:rFonts w:ascii="Lato" w:hAnsi="Lato"/>
+                <w:b w:val="0"/>
+                <w:color w:val="515151"/>
+                <w:sz w:val="20"/>
+              </w:rPr>
+              <w:t>prog_qtd_locacao_de_data_center</w:t>
+            </w:r>
+          </w:p>
+        </w:tc>
+      </w:tr>
+    </w:tbl>
+    <w:p/>
+    <w:p>
+      <w:r>
+        <w:rPr>
+          <w:rFonts w:ascii="Lato" w:hAnsi="Lato"/>
+          <w:b/>
+          <w:i w:val="0"/>
+          <w:color w:val="0C0E0E"/>
+          <w:sz w:val="22"/>
+        </w:rPr>
         <w:t>Regra 7 — Split de Conectores</w:t>
       </w:r>
     </w:p>
@@ -1238,375 +1604,9 @@
           <w:color w:val="515151"/>
           <w:sz w:val="21"/>
         </w:rPr>
-        <w:t>Quando nenhum dos valores prog_qtd_saas, prog_qtd_manutencao ou prog_qtd_connectors está preenchido, o workflow executa o caminho 'Sem Split': cria itens de linha para todos os prog_qtd_* que tiverem valor, usando lin_servico_desc_* como nome do item e prog_qtd_* como preço. Neste caminho, os SKUs dos produtos conhecidos são aplicados via tabela estática.</w:t>
+        <w:t>Quando nenhum dos valores prog_qtd_saas, prog_qtd_manutencao ou prog_qtd_connectors está preenchido, o workflow executa o caminho 'Sem Split': cria itens de linha para todos os prog_qtd_* que tiverem valor, usando as propriedades lin_servico_desc_* do GC como nome do item e prog_qtd_* como preço. Neste caminho, os SKUs dos produtos conhecidos são aplicados via tabela estática.</w:t>
       </w:r>
     </w:p>
-    <w:p/>
-    <w:p>
-      <w:r>
-        <w:rPr>
-          <w:rFonts w:ascii="Lato" w:hAnsi="Lato"/>
-          <w:b/>
-          <w:i w:val="0"/>
-          <w:color w:val="0C0E0E"/>
-          <w:sz w:val="22"/>
-        </w:rPr>
-        <w:t>Regra 6 — Serviços com valor fixo (sem split por módulo)</w:t>
-      </w:r>
-    </w:p>
-    <w:p>
-      <w:pPr>
-        <w:ind w:left="432"/>
-      </w:pPr>
-      <w:r>
-        <w:rPr>
-          <w:rFonts w:ascii="Lato" w:hAnsi="Lato"/>
-          <w:b w:val="0"/>
-          <w:i w:val="0"/>
-          <w:color w:val="515151"/>
-          <w:sz w:val="21"/>
-        </w:rPr>
-        <w:t>Os seguintes serviços não passam por split proporcional — recebem o valor diretamente do prog_qtd correspondente:</w:t>
-      </w:r>
-    </w:p>
-    <w:tbl>
-      <w:tblPr>
-        <w:tblW w:type="auto" w:w="0"/>
-        <w:tblLook w:firstColumn="1" w:firstRow="1" w:lastColumn="0" w:lastRow="0" w:noHBand="0" w:noVBand="1" w:val="04A0"/>
-      </w:tblPr>
-      <w:tblGrid>
-        <w:gridCol w:w="4561"/>
-        <w:gridCol w:w="4561"/>
-      </w:tblGrid>
-      <w:tr>
-        <w:trPr>
-          <w:cantSplit/>
-        </w:trPr>
-        <w:tc>
-          <w:tcPr>
-            <w:tcW w:type="dxa" w:w="5669"/>
-            <w:shd w:val="clear" w:color="auto" w:fill="0C0E0E"/>
-            <w:vAlign w:val="center"/>
-          </w:tcPr>
-          <w:p>
-            <w:r>
-              <w:rPr>
-                <w:rFonts w:ascii="Lato" w:hAnsi="Lato"/>
-                <w:b/>
-                <w:color w:val="FFFFFF"/>
-                <w:sz w:val="20"/>
-              </w:rPr>
-              <w:t>Serviço HubSpot</w:t>
-            </w:r>
-          </w:p>
-        </w:tc>
-        <w:tc>
-          <w:tcPr>
-            <w:tcW w:type="dxa" w:w="4535"/>
-            <w:shd w:val="clear" w:color="auto" w:fill="0C0E0E"/>
-            <w:vAlign w:val="center"/>
-          </w:tcPr>
-          <w:p>
-            <w:r>
-              <w:rPr>
-                <w:rFonts w:ascii="Lato" w:hAnsi="Lato"/>
-                <w:b/>
-                <w:color w:val="FFFFFF"/>
-                <w:sz w:val="20"/>
-              </w:rPr>
-              <w:t>Propriedade Oracle utilizada</w:t>
-            </w:r>
-          </w:p>
-        </w:tc>
-      </w:tr>
-      <w:tr>
-        <w:trPr>
-          <w:cantSplit/>
-        </w:trPr>
-        <w:tc>
-          <w:tcPr>
-            <w:tcW w:type="dxa" w:w="5669"/>
-            <w:shd w:val="clear" w:color="auto" w:fill="FFFFFF"/>
-            <w:vAlign w:val="center"/>
-          </w:tcPr>
-          <w:p>
-            <w:r>
-              <w:rPr>
-                <w:rFonts w:ascii="Lato" w:hAnsi="Lato"/>
-                <w:b w:val="0"/>
-                <w:color w:val="515151"/>
-                <w:sz w:val="20"/>
-              </w:rPr>
-              <w:t>APIs (Start/Essencial/Special/Ultimate/Enterprise)</w:t>
-            </w:r>
-          </w:p>
-        </w:tc>
-        <w:tc>
-          <w:tcPr>
-            <w:tcW w:type="dxa" w:w="4535"/>
-            <w:shd w:val="clear" w:color="auto" w:fill="FFFFFF"/>
-            <w:vAlign w:val="center"/>
-          </w:tcPr>
-          <w:p>
-            <w:r>
-              <w:rPr>
-                <w:rFonts w:ascii="Lato" w:hAnsi="Lato"/>
-                <w:b w:val="0"/>
-                <w:color w:val="515151"/>
-                <w:sz w:val="20"/>
-              </w:rPr>
-              <w:t>prog_qtd_apis</w:t>
-            </w:r>
-          </w:p>
-        </w:tc>
-      </w:tr>
-      <w:tr>
-        <w:trPr>
-          <w:cantSplit/>
-        </w:trPr>
-        <w:tc>
-          <w:tcPr>
-            <w:tcW w:type="dxa" w:w="5669"/>
-            <w:shd w:val="clear" w:color="auto" w:fill="F5F5F5"/>
-            <w:vAlign w:val="center"/>
-          </w:tcPr>
-          <w:p>
-            <w:r>
-              <w:rPr>
-                <w:rFonts w:ascii="Lato" w:hAnsi="Lato"/>
-                <w:b w:val="0"/>
-                <w:color w:val="515151"/>
-                <w:sz w:val="20"/>
-              </w:rPr>
-              <w:t>NFe / NFE até 9 usuários / NFE acima de 10 usuários</w:t>
-            </w:r>
-          </w:p>
-        </w:tc>
-        <w:tc>
-          <w:tcPr>
-            <w:tcW w:type="dxa" w:w="4535"/>
-            <w:shd w:val="clear" w:color="auto" w:fill="F5F5F5"/>
-            <w:vAlign w:val="center"/>
-          </w:tcPr>
-          <w:p>
-            <w:r>
-              <w:rPr>
-                <w:rFonts w:ascii="Lato" w:hAnsi="Lato"/>
-                <w:b w:val="0"/>
-                <w:color w:val="515151"/>
-                <w:sz w:val="20"/>
-              </w:rPr>
-              <w:t>prog_qtd_nota_fiscal_eletronica</w:t>
-            </w:r>
-          </w:p>
-        </w:tc>
-      </w:tr>
-      <w:tr>
-        <w:trPr>
-          <w:cantSplit/>
-        </w:trPr>
-        <w:tc>
-          <w:tcPr>
-            <w:tcW w:type="dxa" w:w="5669"/>
-            <w:shd w:val="clear" w:color="auto" w:fill="FFFFFF"/>
-            <w:vAlign w:val="center"/>
-          </w:tcPr>
-          <w:p>
-            <w:r>
-              <w:rPr>
-                <w:rFonts w:ascii="Lato" w:hAnsi="Lato"/>
-                <w:b w:val="0"/>
-                <w:color w:val="515151"/>
-                <w:sz w:val="20"/>
-              </w:rPr>
-              <w:t>NFs (Nota Fiscal de Serviço)</w:t>
-            </w:r>
-          </w:p>
-        </w:tc>
-        <w:tc>
-          <w:tcPr>
-            <w:tcW w:type="dxa" w:w="4535"/>
-            <w:shd w:val="clear" w:color="auto" w:fill="FFFFFF"/>
-            <w:vAlign w:val="center"/>
-          </w:tcPr>
-          <w:p>
-            <w:r>
-              <w:rPr>
-                <w:rFonts w:ascii="Lato" w:hAnsi="Lato"/>
-                <w:b w:val="0"/>
-                <w:color w:val="515151"/>
-                <w:sz w:val="20"/>
-              </w:rPr>
-              <w:t>prog_qtd_nota_fiscal_de_servico</w:t>
-            </w:r>
-          </w:p>
-        </w:tc>
-      </w:tr>
-      <w:tr>
-        <w:trPr>
-          <w:cantSplit/>
-        </w:trPr>
-        <w:tc>
-          <w:tcPr>
-            <w:tcW w:type="dxa" w:w="5669"/>
-            <w:shd w:val="clear" w:color="auto" w:fill="F5F5F5"/>
-            <w:vAlign w:val="center"/>
-          </w:tcPr>
-          <w:p>
-            <w:r>
-              <w:rPr>
-                <w:rFonts w:ascii="Lato" w:hAnsi="Lato"/>
-                <w:b w:val="0"/>
-                <w:color w:val="515151"/>
-                <w:sz w:val="20"/>
-              </w:rPr>
-              <w:t>Recepção de CTe</w:t>
-            </w:r>
-          </w:p>
-        </w:tc>
-        <w:tc>
-          <w:tcPr>
-            <w:tcW w:type="dxa" w:w="4535"/>
-            <w:shd w:val="clear" w:color="auto" w:fill="F5F5F5"/>
-            <w:vAlign w:val="center"/>
-          </w:tcPr>
-          <w:p>
-            <w:r>
-              <w:rPr>
-                <w:rFonts w:ascii="Lato" w:hAnsi="Lato"/>
-                <w:b w:val="0"/>
-                <w:color w:val="515151"/>
-                <w:sz w:val="20"/>
-              </w:rPr>
-              <w:t>prog_qtd_emissao_de_conhecimento_de_transporte_eletronico_cte</w:t>
-            </w:r>
-          </w:p>
-        </w:tc>
-      </w:tr>
-      <w:tr>
-        <w:trPr>
-          <w:cantSplit/>
-        </w:trPr>
-        <w:tc>
-          <w:tcPr>
-            <w:tcW w:type="dxa" w:w="5669"/>
-            <w:shd w:val="clear" w:color="auto" w:fill="FFFFFF"/>
-            <w:vAlign w:val="center"/>
-          </w:tcPr>
-          <w:p>
-            <w:r>
-              <w:rPr>
-                <w:rFonts w:ascii="Lato" w:hAnsi="Lato"/>
-                <w:b w:val="0"/>
-                <w:color w:val="515151"/>
-                <w:sz w:val="20"/>
-              </w:rPr>
-              <w:t>Base Teste (Sem/Com Anexo, Custo fixo)</w:t>
-            </w:r>
-          </w:p>
-        </w:tc>
-        <w:tc>
-          <w:tcPr>
-            <w:tcW w:type="dxa" w:w="4535"/>
-            <w:shd w:val="clear" w:color="auto" w:fill="FFFFFF"/>
-            <w:vAlign w:val="center"/>
-          </w:tcPr>
-          <w:p>
-            <w:r>
-              <w:rPr>
-                <w:rFonts w:ascii="Lato" w:hAnsi="Lato"/>
-                <w:b w:val="0"/>
-                <w:color w:val="515151"/>
-                <w:sz w:val="20"/>
-              </w:rPr>
-              <w:t>prog_qtd_base_de_testes</w:t>
-            </w:r>
-          </w:p>
-        </w:tc>
-      </w:tr>
-      <w:tr>
-        <w:trPr>
-          <w:cantSplit/>
-        </w:trPr>
-        <w:tc>
-          <w:tcPr>
-            <w:tcW w:type="dxa" w:w="5669"/>
-            <w:shd w:val="clear" w:color="auto" w:fill="F5F5F5"/>
-            <w:vAlign w:val="center"/>
-          </w:tcPr>
-          <w:p>
-            <w:r>
-              <w:rPr>
-                <w:rFonts w:ascii="Lato" w:hAnsi="Lato"/>
-                <w:b w:val="0"/>
-                <w:color w:val="515151"/>
-                <w:sz w:val="20"/>
-              </w:rPr>
-              <w:t>E-Custos</w:t>
-            </w:r>
-          </w:p>
-        </w:tc>
-        <w:tc>
-          <w:tcPr>
-            <w:tcW w:type="dxa" w:w="4535"/>
-            <w:shd w:val="clear" w:color="auto" w:fill="F5F5F5"/>
-            <w:vAlign w:val="center"/>
-          </w:tcPr>
-          <w:p>
-            <w:r>
-              <w:rPr>
-                <w:rFonts w:ascii="Lato" w:hAnsi="Lato"/>
-                <w:b w:val="0"/>
-                <w:color w:val="515151"/>
-                <w:sz w:val="20"/>
-              </w:rPr>
-              <w:t>prog_qtd_ecustos_integracao</w:t>
-            </w:r>
-          </w:p>
-        </w:tc>
-      </w:tr>
-      <w:tr>
-        <w:trPr>
-          <w:cantSplit/>
-        </w:trPr>
-        <w:tc>
-          <w:tcPr>
-            <w:tcW w:type="dxa" w:w="5669"/>
-            <w:shd w:val="clear" w:color="auto" w:fill="FFFFFF"/>
-            <w:vAlign w:val="center"/>
-          </w:tcPr>
-          <w:p>
-            <w:r>
-              <w:rPr>
-                <w:rFonts w:ascii="Lato" w:hAnsi="Lato"/>
-                <w:b w:val="0"/>
-                <w:color w:val="515151"/>
-                <w:sz w:val="20"/>
-              </w:rPr>
-              <w:t>Data Center LU</w:t>
-            </w:r>
-          </w:p>
-        </w:tc>
-        <w:tc>
-          <w:tcPr>
-            <w:tcW w:type="dxa" w:w="4535"/>
-            <w:shd w:val="clear" w:color="auto" w:fill="FFFFFF"/>
-            <w:vAlign w:val="center"/>
-          </w:tcPr>
-          <w:p>
-            <w:r>
-              <w:rPr>
-                <w:rFonts w:ascii="Lato" w:hAnsi="Lato"/>
-                <w:b w:val="0"/>
-                <w:color w:val="515151"/>
-                <w:sz w:val="20"/>
-              </w:rPr>
-              <w:t>prog_qtd_locacao_de_data_center</w:t>
-            </w:r>
-          </w:p>
-        </w:tc>
-      </w:tr>
-    </w:tbl>
     <w:p/>
     <w:p>
       <w:pPr>
@@ -2047,7 +2047,7 @@
                 <w:color w:val="515151"/>
                 <w:sz w:val="20"/>
               </w:rPr>
-              <w:t>Associada ao GC. O [DEV] Integração Oracle em Company é um workflow auxiliar de desenvolvimento.</w:t>
+              <w:t>Associada ao GC. É o objeto a partir do qual o Portfólio é criado.</w:t>
             </w:r>
           </w:p>
         </w:tc>
@@ -2106,7 +2106,7 @@
                 <w:color w:val="515151"/>
                 <w:sz w:val="20"/>
               </w:rPr>
-              <w:t>Recebe atualização de itens de linha via workflow separado após alterações no GC.</w:t>
+              <w:t>Associado ao GC. Recebe agregação de itens de linha via cluster de workflows Portfólio. O workflow [03.01] de atualização direta do GC está atualmente desabilitado (ver Pontos a Validar).</w:t>
             </w:r>
           </w:p>
         </w:tc>
@@ -2136,7 +2136,22 @@
           <w:color w:val="303F63"/>
           <w:sz w:val="22"/>
         </w:rPr>
-        <w:t>Propriedades de Integração Oracle (grupo: integração_oracle)</w:t>
+        <w:t>Propriedades de valores Oracle — prog_qtd_* (grupo: integração_oracle)</w:t>
+      </w:r>
+    </w:p>
+    <w:p>
+      <w:pPr>
+        <w:ind w:left="432"/>
+      </w:pPr>
+      <w:r>
+        <w:rPr>
+          <w:rFonts w:ascii="Lato" w:hAnsi="Lato"/>
+          <w:b w:val="0"/>
+          <w:i w:val="0"/>
+          <w:color w:val="515151"/>
+          <w:sz w:val="20"/>
+        </w:rPr>
+        <w:t>Cada propriedade armazena o valor mensal faturado pelo Oracle para o tipo de serviço correspondente.</w:t>
       </w:r>
     </w:p>
     <w:tbl>
@@ -3384,6 +3399,989 @@
                 <w:sz w:val="20"/>
               </w:rPr>
               <w:t>Log de erro da última sync (quando houver)</w:t>
+            </w:r>
+          </w:p>
+        </w:tc>
+      </w:tr>
+    </w:tbl>
+    <w:p/>
+    <w:p>
+      <w:r>
+        <w:rPr>
+          <w:rFonts w:ascii="Lato" w:hAnsi="Lato"/>
+          <w:b/>
+          <w:i w:val="0"/>
+          <w:color w:val="303F63"/>
+          <w:sz w:val="22"/>
+        </w:rPr>
+        <w:t>Propriedades de descrição Oracle — lin_servico_desc_* (grupo: integração_oracle)</w:t>
+      </w:r>
+    </w:p>
+    <w:p>
+      <w:pPr>
+        <w:ind w:left="432"/>
+      </w:pPr>
+      <w:r>
+        <w:rPr>
+          <w:rFonts w:ascii="Lato" w:hAnsi="Lato"/>
+          <w:b w:val="0"/>
+          <w:i w:val="0"/>
+          <w:color w:val="515151"/>
+          <w:sz w:val="20"/>
+        </w:rPr>
+        <w:t>Armazenam o texto descritivo do serviço retornado pelo Oracle. Usadas pelo workflow de Split no caminho 'Sem Split' como nome do item de linha criado (Regra 11). Confirmadas no schema do Grupo de Contrato via MCP em 15/06/2026.</w:t>
+      </w:r>
+    </w:p>
+    <w:tbl>
+      <w:tblPr>
+        <w:tblW w:type="auto" w:w="0"/>
+        <w:tblLook w:firstColumn="1" w:firstRow="1" w:lastColumn="0" w:lastRow="0" w:noHBand="0" w:noVBand="1" w:val="04A0"/>
+      </w:tblPr>
+      <w:tblGrid>
+        <w:gridCol w:w="3041"/>
+        <w:gridCol w:w="3041"/>
+        <w:gridCol w:w="3041"/>
+      </w:tblGrid>
+      <w:tr>
+        <w:trPr>
+          <w:cantSplit/>
+        </w:trPr>
+        <w:tc>
+          <w:tcPr>
+            <w:tcW w:type="dxa" w:w="4252"/>
+            <w:shd w:val="clear" w:color="auto" w:fill="0C0E0E"/>
+            <w:vAlign w:val="center"/>
+          </w:tcPr>
+          <w:p>
+            <w:r>
+              <w:rPr>
+                <w:rFonts w:ascii="Lato" w:hAnsi="Lato"/>
+                <w:b/>
+                <w:color w:val="FFFFFF"/>
+                <w:sz w:val="20"/>
+              </w:rPr>
+              <w:t>Propriedade HubSpot</w:t>
+            </w:r>
+          </w:p>
+        </w:tc>
+        <w:tc>
+          <w:tcPr>
+            <w:tcW w:type="dxa" w:w="1984"/>
+            <w:shd w:val="clear" w:color="auto" w:fill="0C0E0E"/>
+            <w:vAlign w:val="center"/>
+          </w:tcPr>
+          <w:p>
+            <w:r>
+              <w:rPr>
+                <w:rFonts w:ascii="Lato" w:hAnsi="Lato"/>
+                <w:b/>
+                <w:color w:val="FFFFFF"/>
+                <w:sz w:val="20"/>
+              </w:rPr>
+              <w:t>Valor típico (Oracle)</w:t>
+            </w:r>
+          </w:p>
+        </w:tc>
+        <w:tc>
+          <w:tcPr>
+            <w:tcW w:type="dxa" w:w="3685"/>
+            <w:shd w:val="clear" w:color="auto" w:fill="0C0E0E"/>
+            <w:vAlign w:val="center"/>
+          </w:tcPr>
+          <w:p>
+            <w:r>
+              <w:rPr>
+                <w:rFonts w:ascii="Lato" w:hAnsi="Lato"/>
+                <w:b/>
+                <w:color w:val="FFFFFF"/>
+                <w:sz w:val="20"/>
+              </w:rPr>
+              <w:t>Uso</w:t>
+            </w:r>
+          </w:p>
+        </w:tc>
+      </w:tr>
+      <w:tr>
+        <w:trPr>
+          <w:cantSplit/>
+        </w:trPr>
+        <w:tc>
+          <w:tcPr>
+            <w:tcW w:type="dxa" w:w="4252"/>
+            <w:shd w:val="clear" w:color="auto" w:fill="FFFFFF"/>
+            <w:vAlign w:val="center"/>
+          </w:tcPr>
+          <w:p>
+            <w:r>
+              <w:rPr>
+                <w:rFonts w:ascii="Lato" w:hAnsi="Lato"/>
+                <w:b w:val="0"/>
+                <w:color w:val="515151"/>
+                <w:sz w:val="20"/>
+              </w:rPr>
+              <w:t>lin_servico_desc_saas</w:t>
+            </w:r>
+          </w:p>
+        </w:tc>
+        <w:tc>
+          <w:tcPr>
+            <w:tcW w:type="dxa" w:w="1984"/>
+            <w:shd w:val="clear" w:color="auto" w:fill="FFFFFF"/>
+            <w:vAlign w:val="center"/>
+          </w:tcPr>
+          <w:p>
+            <w:r>
+              <w:rPr>
+                <w:rFonts w:ascii="Lato" w:hAnsi="Lato"/>
+                <w:b w:val="0"/>
+                <w:color w:val="515151"/>
+                <w:sz w:val="20"/>
+              </w:rPr>
+              <w:t>SAAS</w:t>
+            </w:r>
+          </w:p>
+        </w:tc>
+        <w:tc>
+          <w:tcPr>
+            <w:tcW w:type="dxa" w:w="3685"/>
+            <w:shd w:val="clear" w:color="auto" w:fill="FFFFFF"/>
+            <w:vAlign w:val="center"/>
+          </w:tcPr>
+          <w:p>
+            <w:r>
+              <w:rPr>
+                <w:rFonts w:ascii="Lato" w:hAnsi="Lato"/>
+                <w:b w:val="0"/>
+                <w:color w:val="515151"/>
+                <w:sz w:val="20"/>
+              </w:rPr>
+              <w:t>Nome do item no caminho Sem Split</w:t>
+            </w:r>
+          </w:p>
+        </w:tc>
+      </w:tr>
+      <w:tr>
+        <w:trPr>
+          <w:cantSplit/>
+        </w:trPr>
+        <w:tc>
+          <w:tcPr>
+            <w:tcW w:type="dxa" w:w="4252"/>
+            <w:shd w:val="clear" w:color="auto" w:fill="F5F5F5"/>
+            <w:vAlign w:val="center"/>
+          </w:tcPr>
+          <w:p>
+            <w:r>
+              <w:rPr>
+                <w:rFonts w:ascii="Lato" w:hAnsi="Lato"/>
+                <w:b w:val="0"/>
+                <w:color w:val="515151"/>
+                <w:sz w:val="20"/>
+              </w:rPr>
+              <w:t>lin_servico_desc_manutencao</w:t>
+            </w:r>
+          </w:p>
+        </w:tc>
+        <w:tc>
+          <w:tcPr>
+            <w:tcW w:type="dxa" w:w="1984"/>
+            <w:shd w:val="clear" w:color="auto" w:fill="F5F5F5"/>
+            <w:vAlign w:val="center"/>
+          </w:tcPr>
+          <w:p>
+            <w:r>
+              <w:rPr>
+                <w:rFonts w:ascii="Lato" w:hAnsi="Lato"/>
+                <w:b w:val="0"/>
+                <w:color w:val="515151"/>
+                <w:sz w:val="20"/>
+              </w:rPr>
+              <w:t>MANUTENCAO</w:t>
+            </w:r>
+          </w:p>
+        </w:tc>
+        <w:tc>
+          <w:tcPr>
+            <w:tcW w:type="dxa" w:w="3685"/>
+            <w:shd w:val="clear" w:color="auto" w:fill="F5F5F5"/>
+            <w:vAlign w:val="center"/>
+          </w:tcPr>
+          <w:p>
+            <w:r>
+              <w:rPr>
+                <w:rFonts w:ascii="Lato" w:hAnsi="Lato"/>
+                <w:b w:val="0"/>
+                <w:color w:val="515151"/>
+                <w:sz w:val="20"/>
+              </w:rPr>
+              <w:t>Nome do item no caminho Sem Split</w:t>
+            </w:r>
+          </w:p>
+        </w:tc>
+      </w:tr>
+      <w:tr>
+        <w:trPr>
+          <w:cantSplit/>
+        </w:trPr>
+        <w:tc>
+          <w:tcPr>
+            <w:tcW w:type="dxa" w:w="4252"/>
+            <w:shd w:val="clear" w:color="auto" w:fill="FFFFFF"/>
+            <w:vAlign w:val="center"/>
+          </w:tcPr>
+          <w:p>
+            <w:r>
+              <w:rPr>
+                <w:rFonts w:ascii="Lato" w:hAnsi="Lato"/>
+                <w:b w:val="0"/>
+                <w:color w:val="515151"/>
+                <w:sz w:val="20"/>
+              </w:rPr>
+              <w:t>lin_servico_desc_apis</w:t>
+            </w:r>
+          </w:p>
+        </w:tc>
+        <w:tc>
+          <w:tcPr>
+            <w:tcW w:type="dxa" w:w="1984"/>
+            <w:shd w:val="clear" w:color="auto" w:fill="FFFFFF"/>
+            <w:vAlign w:val="center"/>
+          </w:tcPr>
+          <w:p>
+            <w:r>
+              <w:rPr>
+                <w:rFonts w:ascii="Lato" w:hAnsi="Lato"/>
+                <w:b w:val="0"/>
+                <w:color w:val="515151"/>
+                <w:sz w:val="20"/>
+              </w:rPr>
+              <w:t>APIs</w:t>
+            </w:r>
+          </w:p>
+        </w:tc>
+        <w:tc>
+          <w:tcPr>
+            <w:tcW w:type="dxa" w:w="3685"/>
+            <w:shd w:val="clear" w:color="auto" w:fill="FFFFFF"/>
+            <w:vAlign w:val="center"/>
+          </w:tcPr>
+          <w:p>
+            <w:r>
+              <w:rPr>
+                <w:rFonts w:ascii="Lato" w:hAnsi="Lato"/>
+                <w:b w:val="0"/>
+                <w:color w:val="515151"/>
+                <w:sz w:val="20"/>
+              </w:rPr>
+              <w:t>Nome do item no caminho Sem Split</w:t>
+            </w:r>
+          </w:p>
+        </w:tc>
+      </w:tr>
+      <w:tr>
+        <w:trPr>
+          <w:cantSplit/>
+        </w:trPr>
+        <w:tc>
+          <w:tcPr>
+            <w:tcW w:type="dxa" w:w="4252"/>
+            <w:shd w:val="clear" w:color="auto" w:fill="F5F5F5"/>
+            <w:vAlign w:val="center"/>
+          </w:tcPr>
+          <w:p>
+            <w:r>
+              <w:rPr>
+                <w:rFonts w:ascii="Lato" w:hAnsi="Lato"/>
+                <w:b w:val="0"/>
+                <w:color w:val="515151"/>
+                <w:sz w:val="20"/>
+              </w:rPr>
+              <w:t>lin_servico_desc_connectors</w:t>
+            </w:r>
+          </w:p>
+        </w:tc>
+        <w:tc>
+          <w:tcPr>
+            <w:tcW w:type="dxa" w:w="1984"/>
+            <w:shd w:val="clear" w:color="auto" w:fill="F5F5F5"/>
+            <w:vAlign w:val="center"/>
+          </w:tcPr>
+          <w:p>
+            <w:r>
+              <w:rPr>
+                <w:rFonts w:ascii="Lato" w:hAnsi="Lato"/>
+                <w:b w:val="0"/>
+                <w:color w:val="515151"/>
+                <w:sz w:val="20"/>
+              </w:rPr>
+              <w:t>CONNECTORS</w:t>
+            </w:r>
+          </w:p>
+        </w:tc>
+        <w:tc>
+          <w:tcPr>
+            <w:tcW w:type="dxa" w:w="3685"/>
+            <w:shd w:val="clear" w:color="auto" w:fill="F5F5F5"/>
+            <w:vAlign w:val="center"/>
+          </w:tcPr>
+          <w:p>
+            <w:r>
+              <w:rPr>
+                <w:rFonts w:ascii="Lato" w:hAnsi="Lato"/>
+                <w:b w:val="0"/>
+                <w:color w:val="515151"/>
+                <w:sz w:val="20"/>
+              </w:rPr>
+              <w:t>Nome do item no caminho Sem Split</w:t>
+            </w:r>
+          </w:p>
+        </w:tc>
+      </w:tr>
+      <w:tr>
+        <w:trPr>
+          <w:cantSplit/>
+        </w:trPr>
+        <w:tc>
+          <w:tcPr>
+            <w:tcW w:type="dxa" w:w="4252"/>
+            <w:shd w:val="clear" w:color="auto" w:fill="FFFFFF"/>
+            <w:vAlign w:val="center"/>
+          </w:tcPr>
+          <w:p>
+            <w:r>
+              <w:rPr>
+                <w:rFonts w:ascii="Lato" w:hAnsi="Lato"/>
+                <w:b w:val="0"/>
+                <w:color w:val="515151"/>
+                <w:sz w:val="20"/>
+              </w:rPr>
+              <w:t>lin_servico_desc_consultoria</w:t>
+            </w:r>
+          </w:p>
+        </w:tc>
+        <w:tc>
+          <w:tcPr>
+            <w:tcW w:type="dxa" w:w="1984"/>
+            <w:shd w:val="clear" w:color="auto" w:fill="FFFFFF"/>
+            <w:vAlign w:val="center"/>
+          </w:tcPr>
+          <w:p>
+            <w:r>
+              <w:rPr>
+                <w:rFonts w:ascii="Lato" w:hAnsi="Lato"/>
+                <w:b w:val="0"/>
+                <w:color w:val="515151"/>
+                <w:sz w:val="20"/>
+              </w:rPr>
+              <w:t>CONSULTORIA</w:t>
+            </w:r>
+          </w:p>
+        </w:tc>
+        <w:tc>
+          <w:tcPr>
+            <w:tcW w:type="dxa" w:w="3685"/>
+            <w:shd w:val="clear" w:color="auto" w:fill="FFFFFF"/>
+            <w:vAlign w:val="center"/>
+          </w:tcPr>
+          <w:p>
+            <w:r>
+              <w:rPr>
+                <w:rFonts w:ascii="Lato" w:hAnsi="Lato"/>
+                <w:b w:val="0"/>
+                <w:color w:val="515151"/>
+                <w:sz w:val="20"/>
+              </w:rPr>
+              <w:t>Nome do item no caminho Sem Split</w:t>
+            </w:r>
+          </w:p>
+        </w:tc>
+      </w:tr>
+      <w:tr>
+        <w:trPr>
+          <w:cantSplit/>
+        </w:trPr>
+        <w:tc>
+          <w:tcPr>
+            <w:tcW w:type="dxa" w:w="4252"/>
+            <w:shd w:val="clear" w:color="auto" w:fill="F5F5F5"/>
+            <w:vAlign w:val="center"/>
+          </w:tcPr>
+          <w:p>
+            <w:r>
+              <w:rPr>
+                <w:rFonts w:ascii="Lato" w:hAnsi="Lato"/>
+                <w:b w:val="0"/>
+                <w:color w:val="515151"/>
+                <w:sz w:val="20"/>
+              </w:rPr>
+              <w:t>lin_servico_desc_locacao_de_data_center</w:t>
+            </w:r>
+          </w:p>
+        </w:tc>
+        <w:tc>
+          <w:tcPr>
+            <w:tcW w:type="dxa" w:w="1984"/>
+            <w:shd w:val="clear" w:color="auto" w:fill="F5F5F5"/>
+            <w:vAlign w:val="center"/>
+          </w:tcPr>
+          <w:p>
+            <w:r>
+              <w:rPr>
+                <w:rFonts w:ascii="Lato" w:hAnsi="Lato"/>
+                <w:b w:val="0"/>
+                <w:color w:val="515151"/>
+                <w:sz w:val="20"/>
+              </w:rPr>
+              <w:t>LOCACAO DE DATA CENTER</w:t>
+            </w:r>
+          </w:p>
+        </w:tc>
+        <w:tc>
+          <w:tcPr>
+            <w:tcW w:type="dxa" w:w="3685"/>
+            <w:shd w:val="clear" w:color="auto" w:fill="F5F5F5"/>
+            <w:vAlign w:val="center"/>
+          </w:tcPr>
+          <w:p>
+            <w:r>
+              <w:rPr>
+                <w:rFonts w:ascii="Lato" w:hAnsi="Lato"/>
+                <w:b w:val="0"/>
+                <w:color w:val="515151"/>
+                <w:sz w:val="20"/>
+              </w:rPr>
+              <w:t>Nome do item no caminho Sem Split</w:t>
+            </w:r>
+          </w:p>
+        </w:tc>
+      </w:tr>
+      <w:tr>
+        <w:trPr>
+          <w:cantSplit/>
+        </w:trPr>
+        <w:tc>
+          <w:tcPr>
+            <w:tcW w:type="dxa" w:w="4252"/>
+            <w:shd w:val="clear" w:color="auto" w:fill="FFFFFF"/>
+            <w:vAlign w:val="center"/>
+          </w:tcPr>
+          <w:p>
+            <w:r>
+              <w:rPr>
+                <w:rFonts w:ascii="Lato" w:hAnsi="Lato"/>
+                <w:b w:val="0"/>
+                <w:color w:val="515151"/>
+                <w:sz w:val="20"/>
+              </w:rPr>
+              <w:t>lin_servico_desc_base_de_testes</w:t>
+            </w:r>
+          </w:p>
+        </w:tc>
+        <w:tc>
+          <w:tcPr>
+            <w:tcW w:type="dxa" w:w="1984"/>
+            <w:shd w:val="clear" w:color="auto" w:fill="FFFFFF"/>
+            <w:vAlign w:val="center"/>
+          </w:tcPr>
+          <w:p>
+            <w:r>
+              <w:rPr>
+                <w:rFonts w:ascii="Lato" w:hAnsi="Lato"/>
+                <w:b w:val="0"/>
+                <w:color w:val="515151"/>
+                <w:sz w:val="20"/>
+              </w:rPr>
+              <w:t>BASE DE TESTES</w:t>
+            </w:r>
+          </w:p>
+        </w:tc>
+        <w:tc>
+          <w:tcPr>
+            <w:tcW w:type="dxa" w:w="3685"/>
+            <w:shd w:val="clear" w:color="auto" w:fill="FFFFFF"/>
+            <w:vAlign w:val="center"/>
+          </w:tcPr>
+          <w:p>
+            <w:r>
+              <w:rPr>
+                <w:rFonts w:ascii="Lato" w:hAnsi="Lato"/>
+                <w:b w:val="0"/>
+                <w:color w:val="515151"/>
+                <w:sz w:val="20"/>
+              </w:rPr>
+              <w:t>Nome do item no caminho Sem Split</w:t>
+            </w:r>
+          </w:p>
+        </w:tc>
+      </w:tr>
+      <w:tr>
+        <w:trPr>
+          <w:cantSplit/>
+        </w:trPr>
+        <w:tc>
+          <w:tcPr>
+            <w:tcW w:type="dxa" w:w="4252"/>
+            <w:shd w:val="clear" w:color="auto" w:fill="F5F5F5"/>
+            <w:vAlign w:val="center"/>
+          </w:tcPr>
+          <w:p>
+            <w:r>
+              <w:rPr>
+                <w:rFonts w:ascii="Lato" w:hAnsi="Lato"/>
+                <w:b w:val="0"/>
+                <w:color w:val="515151"/>
+                <w:sz w:val="20"/>
+              </w:rPr>
+              <w:t>lin_servico_desc_ecustos_integracao</w:t>
+            </w:r>
+          </w:p>
+        </w:tc>
+        <w:tc>
+          <w:tcPr>
+            <w:tcW w:type="dxa" w:w="1984"/>
+            <w:shd w:val="clear" w:color="auto" w:fill="F5F5F5"/>
+            <w:vAlign w:val="center"/>
+          </w:tcPr>
+          <w:p>
+            <w:r>
+              <w:rPr>
+                <w:rFonts w:ascii="Lato" w:hAnsi="Lato"/>
+                <w:b w:val="0"/>
+                <w:color w:val="515151"/>
+                <w:sz w:val="20"/>
+              </w:rPr>
+              <w:t>ECUSTOS INTEGRAÇÃO</w:t>
+            </w:r>
+          </w:p>
+        </w:tc>
+        <w:tc>
+          <w:tcPr>
+            <w:tcW w:type="dxa" w:w="3685"/>
+            <w:shd w:val="clear" w:color="auto" w:fill="F5F5F5"/>
+            <w:vAlign w:val="center"/>
+          </w:tcPr>
+          <w:p>
+            <w:r>
+              <w:rPr>
+                <w:rFonts w:ascii="Lato" w:hAnsi="Lato"/>
+                <w:b w:val="0"/>
+                <w:color w:val="515151"/>
+                <w:sz w:val="20"/>
+              </w:rPr>
+              <w:t>Nome do item no caminho Sem Split</w:t>
+            </w:r>
+          </w:p>
+        </w:tc>
+      </w:tr>
+      <w:tr>
+        <w:trPr>
+          <w:cantSplit/>
+        </w:trPr>
+        <w:tc>
+          <w:tcPr>
+            <w:tcW w:type="dxa" w:w="4252"/>
+            <w:shd w:val="clear" w:color="auto" w:fill="FFFFFF"/>
+            <w:vAlign w:val="center"/>
+          </w:tcPr>
+          <w:p>
+            <w:r>
+              <w:rPr>
+                <w:rFonts w:ascii="Lato" w:hAnsi="Lato"/>
+                <w:b w:val="0"/>
+                <w:color w:val="515151"/>
+                <w:sz w:val="20"/>
+              </w:rPr>
+              <w:t>lin_servico_desc_nota_fiscal_eletronica</w:t>
+            </w:r>
+          </w:p>
+        </w:tc>
+        <w:tc>
+          <w:tcPr>
+            <w:tcW w:type="dxa" w:w="1984"/>
+            <w:shd w:val="clear" w:color="auto" w:fill="FFFFFF"/>
+            <w:vAlign w:val="center"/>
+          </w:tcPr>
+          <w:p>
+            <w:r>
+              <w:rPr>
+                <w:rFonts w:ascii="Lato" w:hAnsi="Lato"/>
+                <w:b w:val="0"/>
+                <w:color w:val="515151"/>
+                <w:sz w:val="20"/>
+              </w:rPr>
+              <w:t>NOTA FISCAL ELETRONICA</w:t>
+            </w:r>
+          </w:p>
+        </w:tc>
+        <w:tc>
+          <w:tcPr>
+            <w:tcW w:type="dxa" w:w="3685"/>
+            <w:shd w:val="clear" w:color="auto" w:fill="FFFFFF"/>
+            <w:vAlign w:val="center"/>
+          </w:tcPr>
+          <w:p>
+            <w:r>
+              <w:rPr>
+                <w:rFonts w:ascii="Lato" w:hAnsi="Lato"/>
+                <w:b w:val="0"/>
+                <w:color w:val="515151"/>
+                <w:sz w:val="20"/>
+              </w:rPr>
+              <w:t>Nome do item no caminho Sem Split</w:t>
+            </w:r>
+          </w:p>
+        </w:tc>
+      </w:tr>
+      <w:tr>
+        <w:trPr>
+          <w:cantSplit/>
+        </w:trPr>
+        <w:tc>
+          <w:tcPr>
+            <w:tcW w:type="dxa" w:w="4252"/>
+            <w:shd w:val="clear" w:color="auto" w:fill="F5F5F5"/>
+            <w:vAlign w:val="center"/>
+          </w:tcPr>
+          <w:p>
+            <w:r>
+              <w:rPr>
+                <w:rFonts w:ascii="Lato" w:hAnsi="Lato"/>
+                <w:b w:val="0"/>
+                <w:color w:val="515151"/>
+                <w:sz w:val="20"/>
+              </w:rPr>
+              <w:t>lin_servico_desc_nota_fiscal_de_servico</w:t>
+            </w:r>
+          </w:p>
+        </w:tc>
+        <w:tc>
+          <w:tcPr>
+            <w:tcW w:type="dxa" w:w="1984"/>
+            <w:shd w:val="clear" w:color="auto" w:fill="F5F5F5"/>
+            <w:vAlign w:val="center"/>
+          </w:tcPr>
+          <w:p>
+            <w:r>
+              <w:rPr>
+                <w:rFonts w:ascii="Lato" w:hAnsi="Lato"/>
+                <w:b w:val="0"/>
+                <w:color w:val="515151"/>
+                <w:sz w:val="20"/>
+              </w:rPr>
+              <w:t>NOTA FISCAL DE SERVICO</w:t>
+            </w:r>
+          </w:p>
+        </w:tc>
+        <w:tc>
+          <w:tcPr>
+            <w:tcW w:type="dxa" w:w="3685"/>
+            <w:shd w:val="clear" w:color="auto" w:fill="F5F5F5"/>
+            <w:vAlign w:val="center"/>
+          </w:tcPr>
+          <w:p>
+            <w:r>
+              <w:rPr>
+                <w:rFonts w:ascii="Lato" w:hAnsi="Lato"/>
+                <w:b w:val="0"/>
+                <w:color w:val="515151"/>
+                <w:sz w:val="20"/>
+              </w:rPr>
+              <w:t>Nome do item no caminho Sem Split</w:t>
+            </w:r>
+          </w:p>
+        </w:tc>
+      </w:tr>
+      <w:tr>
+        <w:trPr>
+          <w:cantSplit/>
+        </w:trPr>
+        <w:tc>
+          <w:tcPr>
+            <w:tcW w:type="dxa" w:w="4252"/>
+            <w:shd w:val="clear" w:color="auto" w:fill="FFFFFF"/>
+            <w:vAlign w:val="center"/>
+          </w:tcPr>
+          <w:p>
+            <w:r>
+              <w:rPr>
+                <w:rFonts w:ascii="Lato" w:hAnsi="Lato"/>
+                <w:b w:val="0"/>
+                <w:color w:val="515151"/>
+                <w:sz w:val="20"/>
+              </w:rPr>
+              <w:t>lin_servico_desc_emissao_de_conhecimento_de_transporte_eletronico_cte</w:t>
+            </w:r>
+          </w:p>
+        </w:tc>
+        <w:tc>
+          <w:tcPr>
+            <w:tcW w:type="dxa" w:w="1984"/>
+            <w:shd w:val="clear" w:color="auto" w:fill="FFFFFF"/>
+            <w:vAlign w:val="center"/>
+          </w:tcPr>
+          <w:p>
+            <w:r>
+              <w:rPr>
+                <w:rFonts w:ascii="Lato" w:hAnsi="Lato"/>
+                <w:b w:val="0"/>
+                <w:color w:val="515151"/>
+                <w:sz w:val="20"/>
+              </w:rPr>
+              <w:t>EMISSAO DE CTe</w:t>
+            </w:r>
+          </w:p>
+        </w:tc>
+        <w:tc>
+          <w:tcPr>
+            <w:tcW w:type="dxa" w:w="3685"/>
+            <w:shd w:val="clear" w:color="auto" w:fill="FFFFFF"/>
+            <w:vAlign w:val="center"/>
+          </w:tcPr>
+          <w:p>
+            <w:r>
+              <w:rPr>
+                <w:rFonts w:ascii="Lato" w:hAnsi="Lato"/>
+                <w:b w:val="0"/>
+                <w:color w:val="515151"/>
+                <w:sz w:val="20"/>
+              </w:rPr>
+              <w:t>Nome do item no caminho Sem Split</w:t>
+            </w:r>
+          </w:p>
+        </w:tc>
+      </w:tr>
+      <w:tr>
+        <w:trPr>
+          <w:cantSplit/>
+        </w:trPr>
+        <w:tc>
+          <w:tcPr>
+            <w:tcW w:type="dxa" w:w="4252"/>
+            <w:shd w:val="clear" w:color="auto" w:fill="F5F5F5"/>
+            <w:vAlign w:val="center"/>
+          </w:tcPr>
+          <w:p>
+            <w:r>
+              <w:rPr>
+                <w:rFonts w:ascii="Lato" w:hAnsi="Lato"/>
+                <w:b w:val="0"/>
+                <w:color w:val="515151"/>
+                <w:sz w:val="20"/>
+              </w:rPr>
+              <w:t>lin_servico_desc_intermediacao</w:t>
+            </w:r>
+          </w:p>
+        </w:tc>
+        <w:tc>
+          <w:tcPr>
+            <w:tcW w:type="dxa" w:w="1984"/>
+            <w:shd w:val="clear" w:color="auto" w:fill="F5F5F5"/>
+            <w:vAlign w:val="center"/>
+          </w:tcPr>
+          <w:p>
+            <w:r>
+              <w:rPr>
+                <w:rFonts w:ascii="Lato" w:hAnsi="Lato"/>
+                <w:b w:val="0"/>
+                <w:color w:val="515151"/>
+                <w:sz w:val="20"/>
+              </w:rPr>
+              <w:t>INTERMEDIACAO</w:t>
+            </w:r>
+          </w:p>
+        </w:tc>
+        <w:tc>
+          <w:tcPr>
+            <w:tcW w:type="dxa" w:w="3685"/>
+            <w:shd w:val="clear" w:color="auto" w:fill="F5F5F5"/>
+            <w:vAlign w:val="center"/>
+          </w:tcPr>
+          <w:p>
+            <w:r>
+              <w:rPr>
+                <w:rFonts w:ascii="Lato" w:hAnsi="Lato"/>
+                <w:b w:val="0"/>
+                <w:color w:val="515151"/>
+                <w:sz w:val="20"/>
+              </w:rPr>
+              <w:t>Nome do item no caminho Sem Split</w:t>
+            </w:r>
+          </w:p>
+        </w:tc>
+      </w:tr>
+      <w:tr>
+        <w:trPr>
+          <w:cantSplit/>
+        </w:trPr>
+        <w:tc>
+          <w:tcPr>
+            <w:tcW w:type="dxa" w:w="4252"/>
+            <w:shd w:val="clear" w:color="auto" w:fill="FFFFFF"/>
+            <w:vAlign w:val="center"/>
+          </w:tcPr>
+          <w:p>
+            <w:r>
+              <w:rPr>
+                <w:rFonts w:ascii="Lato" w:hAnsi="Lato"/>
+                <w:b w:val="0"/>
+                <w:color w:val="515151"/>
+                <w:sz w:val="20"/>
+              </w:rPr>
+              <w:t>lin_servico_desc_desenvolvimento_fabrica_de_desenvolvimento</w:t>
+            </w:r>
+          </w:p>
+        </w:tc>
+        <w:tc>
+          <w:tcPr>
+            <w:tcW w:type="dxa" w:w="1984"/>
+            <w:shd w:val="clear" w:color="auto" w:fill="FFFFFF"/>
+            <w:vAlign w:val="center"/>
+          </w:tcPr>
+          <w:p>
+            <w:r>
+              <w:rPr>
+                <w:rFonts w:ascii="Lato" w:hAnsi="Lato"/>
+                <w:b w:val="0"/>
+                <w:color w:val="515151"/>
+                <w:sz w:val="20"/>
+              </w:rPr>
+              <w:t>DESENVOLVIMENTO (FABRICA)</w:t>
+            </w:r>
+          </w:p>
+        </w:tc>
+        <w:tc>
+          <w:tcPr>
+            <w:tcW w:type="dxa" w:w="3685"/>
+            <w:shd w:val="clear" w:color="auto" w:fill="FFFFFF"/>
+            <w:vAlign w:val="center"/>
+          </w:tcPr>
+          <w:p>
+            <w:r>
+              <w:rPr>
+                <w:rFonts w:ascii="Lato" w:hAnsi="Lato"/>
+                <w:b w:val="0"/>
+                <w:color w:val="515151"/>
+                <w:sz w:val="20"/>
+              </w:rPr>
+              <w:t>Nome do item no caminho Sem Split</w:t>
+            </w:r>
+          </w:p>
+        </w:tc>
+      </w:tr>
+      <w:tr>
+        <w:trPr>
+          <w:cantSplit/>
+        </w:trPr>
+        <w:tc>
+          <w:tcPr>
+            <w:tcW w:type="dxa" w:w="4252"/>
+            <w:shd w:val="clear" w:color="auto" w:fill="F5F5F5"/>
+            <w:vAlign w:val="center"/>
+          </w:tcPr>
+          <w:p>
+            <w:r>
+              <w:rPr>
+                <w:rFonts w:ascii="Lato" w:hAnsi="Lato"/>
+                <w:b w:val="0"/>
+                <w:color w:val="515151"/>
+                <w:sz w:val="20"/>
+              </w:rPr>
+              <w:t>lin_servico_desc_licenca_de_uso_base_client_share</w:t>
+            </w:r>
+          </w:p>
+        </w:tc>
+        <w:tc>
+          <w:tcPr>
+            <w:tcW w:type="dxa" w:w="1984"/>
+            <w:shd w:val="clear" w:color="auto" w:fill="F5F5F5"/>
+            <w:vAlign w:val="center"/>
+          </w:tcPr>
+          <w:p>
+            <w:r>
+              <w:rPr>
+                <w:rFonts w:ascii="Lato" w:hAnsi="Lato"/>
+                <w:b w:val="0"/>
+                <w:color w:val="515151"/>
+                <w:sz w:val="20"/>
+              </w:rPr>
+              <w:t>LICENCA DE USO BASE (CLIENT SHARE)</w:t>
+            </w:r>
+          </w:p>
+        </w:tc>
+        <w:tc>
+          <w:tcPr>
+            <w:tcW w:type="dxa" w:w="3685"/>
+            <w:shd w:val="clear" w:color="auto" w:fill="F5F5F5"/>
+            <w:vAlign w:val="center"/>
+          </w:tcPr>
+          <w:p>
+            <w:r>
+              <w:rPr>
+                <w:rFonts w:ascii="Lato" w:hAnsi="Lato"/>
+                <w:b w:val="0"/>
+                <w:color w:val="515151"/>
+                <w:sz w:val="20"/>
+              </w:rPr>
+              <w:t>Nome do item no caminho Sem Split</w:t>
+            </w:r>
+          </w:p>
+        </w:tc>
+      </w:tr>
+      <w:tr>
+        <w:trPr>
+          <w:cantSplit/>
+        </w:trPr>
+        <w:tc>
+          <w:tcPr>
+            <w:tcW w:type="dxa" w:w="4252"/>
+            <w:shd w:val="clear" w:color="auto" w:fill="FFFFFF"/>
+            <w:vAlign w:val="center"/>
+          </w:tcPr>
+          <w:p>
+            <w:r>
+              <w:rPr>
+                <w:rFonts w:ascii="Lato" w:hAnsi="Lato"/>
+                <w:b w:val="0"/>
+                <w:color w:val="515151"/>
+                <w:sz w:val="20"/>
+              </w:rPr>
+              <w:t>lin_servico_desc_hs</w:t>
+            </w:r>
+          </w:p>
+        </w:tc>
+        <w:tc>
+          <w:tcPr>
+            <w:tcW w:type="dxa" w:w="1984"/>
+            <w:shd w:val="clear" w:color="auto" w:fill="FFFFFF"/>
+            <w:vAlign w:val="center"/>
+          </w:tcPr>
+          <w:p>
+            <w:r>
+              <w:rPr>
+                <w:rFonts w:ascii="Lato" w:hAnsi="Lato"/>
+                <w:b w:val="0"/>
+                <w:color w:val="515151"/>
+                <w:sz w:val="20"/>
+              </w:rPr>
+              <w:t>variável</w:t>
+            </w:r>
+          </w:p>
+        </w:tc>
+        <w:tc>
+          <w:tcPr>
+            <w:tcW w:type="dxa" w:w="3685"/>
+            <w:shd w:val="clear" w:color="auto" w:fill="FFFFFF"/>
+            <w:vAlign w:val="center"/>
+          </w:tcPr>
+          <w:p>
+            <w:r>
+              <w:rPr>
+                <w:rFonts w:ascii="Lato" w:hAnsi="Lato"/>
+                <w:b w:val="0"/>
+                <w:color w:val="515151"/>
+                <w:sz w:val="20"/>
+              </w:rPr>
+              <w:t>Campo genérico de descrição (primeira ocorrência Oracle)</w:t>
             </w:r>
           </w:p>
         </w:tc>
@@ -3970,7 +4968,7 @@
                 <w:color w:val="303F63"/>
                 <w:sz w:val="19"/>
               </w:rPr>
-              <w:t>Status</w:t>
+              <w:t>Objetivo</w:t>
             </w:r>
           </w:p>
         </w:tc>
@@ -3986,7 +4984,7 @@
                 <w:color w:val="515151"/>
                 <w:sz w:val="19"/>
               </w:rPr>
-              <w:t>Ativo (DEV)</w:t>
+              <w:t>Autenticar no Oracle ERP, consultar os valores de contrato do dia e gravar nas propriedades prog_qtd_* do Grupo de Contrato correspondente.</w:t>
             </w:r>
           </w:p>
         </w:tc>
@@ -4005,7 +5003,7 @@
                 <w:color w:val="303F63"/>
                 <w:sz w:val="19"/>
               </w:rPr>
-              <w:t>Objeto HubSpot</w:t>
+              <w:t>Status</w:t>
             </w:r>
           </w:p>
         </w:tc>
@@ -4021,7 +5019,7 @@
                 <w:color w:val="515151"/>
                 <w:sz w:val="19"/>
               </w:rPr>
-              <w:t>Grupo de Contrato (2-54707985)</w:t>
+              <w:t>Ativo (DEV)</w:t>
             </w:r>
           </w:p>
         </w:tc>
@@ -4040,7 +5038,7 @@
                 <w:color w:val="303F63"/>
                 <w:sz w:val="19"/>
               </w:rPr>
-              <w:t>Disparo</w:t>
+              <w:t>Objeto HubSpot</w:t>
             </w:r>
           </w:p>
         </w:tc>
@@ -4056,7 +5054,7 @@
                 <w:color w:val="515151"/>
                 <w:sz w:val="19"/>
               </w:rPr>
-              <w:t>Agendado diariamente às 03:30h (schedule). Re-enrollment ativo.</w:t>
+              <w:t>Grupo de Contrato (2-54707985)</w:t>
             </w:r>
           </w:p>
         </w:tc>
@@ -4075,7 +5073,7 @@
                 <w:color w:val="303F63"/>
                 <w:sz w:val="19"/>
               </w:rPr>
-              <w:t>Ações principais</w:t>
+              <w:t>Disparo</w:t>
             </w:r>
           </w:p>
         </w:tc>
@@ -4083,6 +5081,41 @@
           <w:tcPr>
             <w:tcW w:type="dxa" w:w="7370"/>
             <w:shd w:val="clear" w:color="auto" w:fill="FFFFFF"/>
+          </w:tcPr>
+          <w:p>
+            <w:r>
+              <w:rPr>
+                <w:rFonts w:ascii="Lato" w:hAnsi="Lato"/>
+                <w:color w:val="515151"/>
+                <w:sz w:val="19"/>
+              </w:rPr>
+              <w:t>Agendado diariamente às 03:30h (schedule). Re-enrollment ativo.</w:t>
+            </w:r>
+          </w:p>
+        </w:tc>
+      </w:tr>
+      <w:tr>
+        <w:tc>
+          <w:tcPr>
+            <w:tcW w:type="dxa" w:w="2551"/>
+            <w:shd w:val="clear" w:color="auto" w:fill="EEF3FB"/>
+          </w:tcPr>
+          <w:p>
+            <w:r>
+              <w:rPr>
+                <w:rFonts w:ascii="Lato" w:hAnsi="Lato"/>
+                <w:b/>
+                <w:color w:val="303F63"/>
+                <w:sz w:val="19"/>
+              </w:rPr>
+              <w:t>Ações principais</w:t>
+            </w:r>
+          </w:p>
+        </w:tc>
+        <w:tc>
+          <w:tcPr>
+            <w:tcW w:type="dxa" w:w="7370"/>
+            <w:shd w:val="clear" w:color="auto" w:fill="F5F5F5"/>
           </w:tcPr>
           <w:p>
             <w:r>
@@ -4125,7 +5158,7 @@
         <w:tc>
           <w:tcPr>
             <w:tcW w:type="dxa" w:w="7370"/>
-            <w:shd w:val="clear" w:color="auto" w:fill="F5F5F5"/>
+            <w:shd w:val="clear" w:color="auto" w:fill="FFFFFF"/>
           </w:tcPr>
           <w:p>
             <w:r>
@@ -4134,7 +5167,7 @@
                 <w:color w:val="515151"/>
                 <w:sz w:val="19"/>
               </w:rPr>
-              <w:t>Enrollment atual: um único GC específico (hs_object_id 45054877487) — configuração de desenvolvimento. O mecanismo de atualização em massa das propriedades prog_qtd_* nos GCs de produção não está mapeado no HubSpot via MCP.</w:t>
+              <w:t>Enrollment atual: um único GC específico (hs_object_id 45054877487) — configuração de desenvolvimento. O mecanismo de atualização em massa das propriedades prog_qtd_* nos GCs de produção não está mapeado no HubSpot via MCP. Ver PV-01.</w:t>
             </w:r>
           </w:p>
         </w:tc>
@@ -4211,7 +5244,7 @@
                 <w:color w:val="303F63"/>
                 <w:sz w:val="19"/>
               </w:rPr>
-              <w:t>Status</w:t>
+              <w:t>Objetivo</w:t>
             </w:r>
           </w:p>
         </w:tc>
@@ -4227,7 +5260,7 @@
                 <w:color w:val="515151"/>
                 <w:sz w:val="19"/>
               </w:rPr>
-              <w:t>Ativo</w:t>
+              <w:t>Reconstruir os itens de linha do Grupo de Contrato refletindo os valores Oracle atualizados, distribuindo proporcionalmente por módulo/sistema quando aplicável.</w:t>
             </w:r>
           </w:p>
         </w:tc>
@@ -4246,7 +5279,7 @@
                 <w:color w:val="303F63"/>
                 <w:sz w:val="19"/>
               </w:rPr>
-              <w:t>Objeto HubSpot</w:t>
+              <w:t>Status</w:t>
             </w:r>
           </w:p>
         </w:tc>
@@ -4262,7 +5295,7 @@
                 <w:color w:val="515151"/>
                 <w:sz w:val="19"/>
               </w:rPr>
-              <w:t>Grupo de Contrato (2-54707985)</w:t>
+              <w:t>Ativo</w:t>
             </w:r>
           </w:p>
         </w:tc>
@@ -4281,7 +5314,7 @@
                 <w:color w:val="303F63"/>
                 <w:sz w:val="19"/>
               </w:rPr>
-              <w:t>Disparo</w:t>
+              <w:t>Objeto HubSpot</w:t>
             </w:r>
           </w:p>
         </w:tc>
@@ -4297,7 +5330,7 @@
                 <w:color w:val="515151"/>
                 <w:sz w:val="19"/>
               </w:rPr>
-              <w:t>Re-enrollment ativo. Disparado por qualquer alteração em qualquer propriedade prog_qtd_* ou na propriedade sistema. Suprimido para GCs com status = 'Cancelado'.</w:t>
+              <w:t>Grupo de Contrato (2-54707985)</w:t>
             </w:r>
           </w:p>
         </w:tc>
@@ -4316,7 +5349,7 @@
                 <w:color w:val="303F63"/>
                 <w:sz w:val="19"/>
               </w:rPr>
-              <w:t>Ações principais</w:t>
+              <w:t>Disparo</w:t>
             </w:r>
           </w:p>
         </w:tc>
@@ -4324,6 +5357,41 @@
           <w:tcPr>
             <w:tcW w:type="dxa" w:w="7370"/>
             <w:shd w:val="clear" w:color="auto" w:fill="FFFFFF"/>
+          </w:tcPr>
+          <w:p>
+            <w:r>
+              <w:rPr>
+                <w:rFonts w:ascii="Lato" w:hAnsi="Lato"/>
+                <w:color w:val="515151"/>
+                <w:sz w:val="19"/>
+              </w:rPr>
+              <w:t>Re-enrollment ativo. Disparado por qualquer alteração em qualquer propriedade prog_qtd_* ou na propriedade sistema. Suprimido para GCs com status = 'Cancelado'.</w:t>
+            </w:r>
+          </w:p>
+        </w:tc>
+      </w:tr>
+      <w:tr>
+        <w:tc>
+          <w:tcPr>
+            <w:tcW w:type="dxa" w:w="2551"/>
+            <w:shd w:val="clear" w:color="auto" w:fill="EEF3FB"/>
+          </w:tcPr>
+          <w:p>
+            <w:r>
+              <w:rPr>
+                <w:rFonts w:ascii="Lato" w:hAnsi="Lato"/>
+                <w:b/>
+                <w:color w:val="303F63"/>
+                <w:sz w:val="19"/>
+              </w:rPr>
+              <w:t>Ações principais</w:t>
+            </w:r>
+          </w:p>
+        </w:tc>
+        <w:tc>
+          <w:tcPr>
+            <w:tcW w:type="dxa" w:w="7370"/>
+            <w:shd w:val="clear" w:color="auto" w:fill="F5F5F5"/>
           </w:tcPr>
           <w:p>
             <w:r>
@@ -4358,7 +5426,7 @@
               <w:br/>
               <w:t>7. Branch 'Sem Split' (demais casos):</w:t>
               <w:br/>
-              <w:t xml:space="preserve">   — Cria item por prog_qtd_* não nulo, usando lin_servico_desc_* como nome e prog_qtd como preço.</w:t>
+              <w:t xml:space="preserve">   — Cria item por prog_qtd_* não nulo, usando lin_servico_desc_* do GC como nome e prog_qtd como preço.</w:t>
             </w:r>
           </w:p>
         </w:tc>
@@ -4384,7 +5452,7 @@
         <w:tc>
           <w:tcPr>
             <w:tcW w:type="dxa" w:w="7370"/>
-            <w:shd w:val="clear" w:color="auto" w:fill="F5F5F5"/>
+            <w:shd w:val="clear" w:color="auto" w:fill="FFFFFF"/>
           </w:tcPr>
           <w:p>
             <w:r>
@@ -4470,7 +5538,7 @@
                 <w:color w:val="303F63"/>
                 <w:sz w:val="19"/>
               </w:rPr>
-              <w:t>Status</w:t>
+              <w:t>Objetivo</w:t>
             </w:r>
           </w:p>
         </w:tc>
@@ -4486,7 +5554,7 @@
                 <w:color w:val="515151"/>
                 <w:sz w:val="19"/>
               </w:rPr>
-              <w:t>Ativo</w:t>
+              <w:t>Criar ou associar o Grupo de Contrato correto quando um novo Contrato é registrado, propagando os valores iniciais de prog_qtd_* e os itens de linha elegíveis.</w:t>
             </w:r>
           </w:p>
         </w:tc>
@@ -4505,7 +5573,7 @@
                 <w:color w:val="303F63"/>
                 <w:sz w:val="19"/>
               </w:rPr>
-              <w:t>Objeto HubSpot</w:t>
+              <w:t>Status</w:t>
             </w:r>
           </w:p>
         </w:tc>
@@ -4521,7 +5589,7 @@
                 <w:color w:val="515151"/>
                 <w:sz w:val="19"/>
               </w:rPr>
-              <w:t>Contrato (2-54707915)</w:t>
+              <w:t>Ativo</w:t>
             </w:r>
           </w:p>
         </w:tc>
@@ -4540,7 +5608,7 @@
                 <w:color w:val="303F63"/>
                 <w:sz w:val="19"/>
               </w:rPr>
-              <w:t>Disparo</w:t>
+              <w:t>Objeto HubSpot</w:t>
             </w:r>
           </w:p>
         </w:tc>
@@ -4556,7 +5624,7 @@
                 <w:color w:val="515151"/>
                 <w:sz w:val="19"/>
               </w:rPr>
-              <w:t>Criação de Contrato com tipo_de_orcamento = 'Primeira Venda', 'Aditivo de Retração' ou 'Aditivo de Expansão'. Re-enrollment ativo.</w:t>
+              <w:t>Contrato (2-54707915)</w:t>
             </w:r>
           </w:p>
         </w:tc>
@@ -4575,7 +5643,7 @@
                 <w:color w:val="303F63"/>
                 <w:sz w:val="19"/>
               </w:rPr>
-              <w:t>Ações principais</w:t>
+              <w:t>Disparo</w:t>
             </w:r>
           </w:p>
         </w:tc>
@@ -4583,6 +5651,41 @@
           <w:tcPr>
             <w:tcW w:type="dxa" w:w="7370"/>
             <w:shd w:val="clear" w:color="auto" w:fill="FFFFFF"/>
+          </w:tcPr>
+          <w:p>
+            <w:r>
+              <w:rPr>
+                <w:rFonts w:ascii="Lato" w:hAnsi="Lato"/>
+                <w:color w:val="515151"/>
+                <w:sz w:val="19"/>
+              </w:rPr>
+              <w:t>Criação de Contrato com tipo_de_orcamento = 'Primeira Venda', 'Aditivo de Retração' ou 'Aditivo de Expansão'. Re-enrollment ativo.</w:t>
+            </w:r>
+          </w:p>
+        </w:tc>
+      </w:tr>
+      <w:tr>
+        <w:tc>
+          <w:tcPr>
+            <w:tcW w:type="dxa" w:w="2551"/>
+            <w:shd w:val="clear" w:color="auto" w:fill="EEF3FB"/>
+          </w:tcPr>
+          <w:p>
+            <w:r>
+              <w:rPr>
+                <w:rFonts w:ascii="Lato" w:hAnsi="Lato"/>
+                <w:b/>
+                <w:color w:val="303F63"/>
+                <w:sz w:val="19"/>
+              </w:rPr>
+              <w:t>Ações principais</w:t>
+            </w:r>
+          </w:p>
+        </w:tc>
+        <w:tc>
+          <w:tcPr>
+            <w:tcW w:type="dxa" w:w="7370"/>
+            <w:shd w:val="clear" w:color="auto" w:fill="F5F5F5"/>
           </w:tcPr>
           <w:p>
             <w:r>
@@ -4635,7 +5738,7 @@
         <w:tc>
           <w:tcPr>
             <w:tcW w:type="dxa" w:w="7370"/>
-            <w:shd w:val="clear" w:color="auto" w:fill="F5F5F5"/>
+            <w:shd w:val="clear" w:color="auto" w:fill="FFFFFF"/>
           </w:tcPr>
           <w:p>
             <w:r>
@@ -4721,7 +5824,7 @@
                 <w:color w:val="303F63"/>
                 <w:sz w:val="19"/>
               </w:rPr>
-              <w:t>Status</w:t>
+              <w:t>Objetivo</w:t>
             </w:r>
           </w:p>
         </w:tc>
@@ -4737,7 +5840,7 @@
                 <w:color w:val="515151"/>
                 <w:sz w:val="19"/>
               </w:rPr>
-              <w:t>Ativo</w:t>
+              <w:t>Atualizar os campos financeiros consolidados do GC (MRR, Valor SaaS, Valor Serviço, MM LU, DC LU) após cada sync Oracle.</w:t>
             </w:r>
           </w:p>
         </w:tc>
@@ -4756,7 +5859,7 @@
                 <w:color w:val="303F63"/>
                 <w:sz w:val="19"/>
               </w:rPr>
-              <w:t>Objeto HubSpot</w:t>
+              <w:t>Status</w:t>
             </w:r>
           </w:p>
         </w:tc>
@@ -4772,7 +5875,7 @@
                 <w:color w:val="515151"/>
                 <w:sz w:val="19"/>
               </w:rPr>
-              <w:t>Grupo de Contrato (2-54707985)</w:t>
+              <w:t>Ativo</w:t>
             </w:r>
           </w:p>
         </w:tc>
@@ -4791,7 +5894,7 @@
                 <w:color w:val="303F63"/>
                 <w:sz w:val="19"/>
               </w:rPr>
-              <w:t>Disparo</w:t>
+              <w:t>Objeto HubSpot</w:t>
             </w:r>
           </w:p>
         </w:tc>
@@ -4807,7 +5910,7 @@
                 <w:color w:val="515151"/>
                 <w:sz w:val="19"/>
               </w:rPr>
-              <w:t>Atualização em prog_qtd_*. Re-enrollment ativo.</w:t>
+              <w:t>Grupo de Contrato (2-54707985)</w:t>
             </w:r>
           </w:p>
         </w:tc>
@@ -4826,7 +5929,7 @@
                 <w:color w:val="303F63"/>
                 <w:sz w:val="19"/>
               </w:rPr>
-              <w:t>Ações principais</w:t>
+              <w:t>Disparo</w:t>
             </w:r>
           </w:p>
         </w:tc>
@@ -4834,6 +5937,41 @@
           <w:tcPr>
             <w:tcW w:type="dxa" w:w="7370"/>
             <w:shd w:val="clear" w:color="auto" w:fill="FFFFFF"/>
+          </w:tcPr>
+          <w:p>
+            <w:r>
+              <w:rPr>
+                <w:rFonts w:ascii="Lato" w:hAnsi="Lato"/>
+                <w:color w:val="515151"/>
+                <w:sz w:val="19"/>
+              </w:rPr>
+              <w:t>Atualização em prog_qtd_*. Re-enrollment ativo.</w:t>
+            </w:r>
+          </w:p>
+        </w:tc>
+      </w:tr>
+      <w:tr>
+        <w:tc>
+          <w:tcPr>
+            <w:tcW w:type="dxa" w:w="2551"/>
+            <w:shd w:val="clear" w:color="auto" w:fill="EEF3FB"/>
+          </w:tcPr>
+          <w:p>
+            <w:r>
+              <w:rPr>
+                <w:rFonts w:ascii="Lato" w:hAnsi="Lato"/>
+                <w:b/>
+                <w:color w:val="303F63"/>
+                <w:sz w:val="19"/>
+              </w:rPr>
+              <w:t>Ações principais</w:t>
+            </w:r>
+          </w:p>
+        </w:tc>
+        <w:tc>
+          <w:tcPr>
+            <w:tcW w:type="dxa" w:w="7370"/>
+            <w:shd w:val="clear" w:color="auto" w:fill="F5F5F5"/>
           </w:tcPr>
           <w:p>
             <w:r>
@@ -4876,6 +6014,124 @@
         <w:tc>
           <w:tcPr>
             <w:tcW w:type="dxa" w:w="7370"/>
+            <w:shd w:val="clear" w:color="auto" w:fill="FFFFFF"/>
+          </w:tcPr>
+          <w:p>
+            <w:r>
+              <w:rPr>
+                <w:rFonts w:ascii="Lato" w:hAnsi="Lato"/>
+                <w:color w:val="515151"/>
+                <w:sz w:val="19"/>
+              </w:rPr>
+              <w:t>Executam em cascata após atualização dos prog_qtd_*.</w:t>
+            </w:r>
+          </w:p>
+        </w:tc>
+      </w:tr>
+    </w:tbl>
+    <w:p/>
+    <w:p>
+      <w:r>
+        <w:rPr>
+          <w:rFonts w:ascii="Lato" w:hAnsi="Lato"/>
+          <w:b/>
+          <w:i w:val="0"/>
+          <w:color w:val="0C0E0E"/>
+          <w:sz w:val="24"/>
+        </w:rPr>
+        <w:t>Cluster de workflows — Portfólio</w:t>
+      </w:r>
+    </w:p>
+    <w:p>
+      <w:r>
+        <w:rPr>
+          <w:rFonts w:ascii="Lato" w:hAnsi="Lato"/>
+          <w:b w:val="0"/>
+          <w:i w:val="0"/>
+          <w:color w:val="515151"/>
+          <w:sz w:val="21"/>
+        </w:rPr>
+        <w:t>O Portfólio é gerenciado por um cluster de workflows identificados no HubSpot. O workflow [03.01] que atualizava o Portfólio diretamente a partir de alterações no GC está atualmente desabilitado — ver PV-07.</w:t>
+      </w:r>
+    </w:p>
+    <w:p/>
+    <w:p>
+      <w:r>
+        <w:rPr>
+          <w:rFonts w:ascii="Lato" w:hAnsi="Lato"/>
+          <w:b/>
+          <w:color w:val="303F63"/>
+          <w:sz w:val="22"/>
+        </w:rPr>
+        <w:t>Workflow: [01 - Portfólio] Empresa = Cliente → Cria portfólio</w:t>
+      </w:r>
+    </w:p>
+    <w:tbl>
+      <w:tblPr>
+        <w:tblStyle w:val="TableGrid"/>
+        <w:tblW w:type="auto" w:w="0"/>
+        <w:tblLook w:firstColumn="1" w:firstRow="1" w:lastColumn="0" w:lastRow="0" w:noHBand="0" w:noVBand="1" w:val="04A0"/>
+      </w:tblPr>
+      <w:tblGrid>
+        <w:gridCol w:w="4561"/>
+        <w:gridCol w:w="4561"/>
+      </w:tblGrid>
+      <w:tr>
+        <w:tc>
+          <w:tcPr>
+            <w:tcW w:type="dxa" w:w="2551"/>
+            <w:shd w:val="clear" w:color="auto" w:fill="EEF3FB"/>
+          </w:tcPr>
+          <w:p>
+            <w:r>
+              <w:rPr>
+                <w:rFonts w:ascii="Lato" w:hAnsi="Lato"/>
+                <w:b/>
+                <w:color w:val="303F63"/>
+                <w:sz w:val="19"/>
+              </w:rPr>
+              <w:t>ID</w:t>
+            </w:r>
+          </w:p>
+        </w:tc>
+        <w:tc>
+          <w:tcPr>
+            <w:tcW w:type="dxa" w:w="7370"/>
+            <w:shd w:val="clear" w:color="auto" w:fill="FFFFFF"/>
+          </w:tcPr>
+          <w:p>
+            <w:r>
+              <w:rPr>
+                <w:rFonts w:ascii="Lato" w:hAnsi="Lato"/>
+                <w:color w:val="515151"/>
+                <w:sz w:val="19"/>
+              </w:rPr>
+              <w:t>1769155744</w:t>
+            </w:r>
+          </w:p>
+        </w:tc>
+      </w:tr>
+      <w:tr>
+        <w:tc>
+          <w:tcPr>
+            <w:tcW w:type="dxa" w:w="2551"/>
+            <w:shd w:val="clear" w:color="auto" w:fill="EEF3FB"/>
+          </w:tcPr>
+          <w:p>
+            <w:r>
+              <w:rPr>
+                <w:rFonts w:ascii="Lato" w:hAnsi="Lato"/>
+                <w:b/>
+                <w:color w:val="303F63"/>
+                <w:sz w:val="19"/>
+              </w:rPr>
+              <w:t>Objetivo</w:t>
+            </w:r>
+          </w:p>
+        </w:tc>
+        <w:tc>
+          <w:tcPr>
+            <w:tcW w:type="dxa" w:w="7370"/>
             <w:shd w:val="clear" w:color="auto" w:fill="F5F5F5"/>
           </w:tcPr>
           <w:p>
@@ -4885,7 +6141,1254 @@
                 <w:color w:val="515151"/>
                 <w:sz w:val="19"/>
               </w:rPr>
-              <w:t>Executam em cascata após atualização dos prog_qtd_*.</w:t>
+              <w:t>Criar um registro de Portfólio no HubSpot quando uma Empresa é marcada como cliente.</w:t>
+            </w:r>
+          </w:p>
+        </w:tc>
+      </w:tr>
+      <w:tr>
+        <w:tc>
+          <w:tcPr>
+            <w:tcW w:type="dxa" w:w="2551"/>
+            <w:shd w:val="clear" w:color="auto" w:fill="EEF3FB"/>
+          </w:tcPr>
+          <w:p>
+            <w:r>
+              <w:rPr>
+                <w:rFonts w:ascii="Lato" w:hAnsi="Lato"/>
+                <w:b/>
+                <w:color w:val="303F63"/>
+                <w:sz w:val="19"/>
+              </w:rPr>
+              <w:t>Status</w:t>
+            </w:r>
+          </w:p>
+        </w:tc>
+        <w:tc>
+          <w:tcPr>
+            <w:tcW w:type="dxa" w:w="7370"/>
+            <w:shd w:val="clear" w:color="auto" w:fill="FFFFFF"/>
+          </w:tcPr>
+          <w:p>
+            <w:r>
+              <w:rPr>
+                <w:rFonts w:ascii="Lato" w:hAnsi="Lato"/>
+                <w:color w:val="515151"/>
+                <w:sz w:val="19"/>
+              </w:rPr>
+              <w:t>Ativo</w:t>
+            </w:r>
+          </w:p>
+        </w:tc>
+      </w:tr>
+      <w:tr>
+        <w:tc>
+          <w:tcPr>
+            <w:tcW w:type="dxa" w:w="2551"/>
+            <w:shd w:val="clear" w:color="auto" w:fill="EEF3FB"/>
+          </w:tcPr>
+          <w:p>
+            <w:r>
+              <w:rPr>
+                <w:rFonts w:ascii="Lato" w:hAnsi="Lato"/>
+                <w:b/>
+                <w:color w:val="303F63"/>
+                <w:sz w:val="19"/>
+              </w:rPr>
+              <w:t>Objeto HubSpot</w:t>
+            </w:r>
+          </w:p>
+        </w:tc>
+        <w:tc>
+          <w:tcPr>
+            <w:tcW w:type="dxa" w:w="7370"/>
+            <w:shd w:val="clear" w:color="auto" w:fill="F5F5F5"/>
+          </w:tcPr>
+          <w:p>
+            <w:r>
+              <w:rPr>
+                <w:rFonts w:ascii="Lato" w:hAnsi="Lato"/>
+                <w:color w:val="515151"/>
+                <w:sz w:val="19"/>
+              </w:rPr>
+              <w:t>Empresa (0-2)</w:t>
+            </w:r>
+          </w:p>
+        </w:tc>
+      </w:tr>
+      <w:tr>
+        <w:tc>
+          <w:tcPr>
+            <w:tcW w:type="dxa" w:w="2551"/>
+            <w:shd w:val="clear" w:color="auto" w:fill="EEF3FB"/>
+          </w:tcPr>
+          <w:p>
+            <w:r>
+              <w:rPr>
+                <w:rFonts w:ascii="Lato" w:hAnsi="Lato"/>
+                <w:b/>
+                <w:color w:val="303F63"/>
+                <w:sz w:val="19"/>
+              </w:rPr>
+              <w:t>Disparo</w:t>
+            </w:r>
+          </w:p>
+        </w:tc>
+        <w:tc>
+          <w:tcPr>
+            <w:tcW w:type="dxa" w:w="7370"/>
+            <w:shd w:val="clear" w:color="auto" w:fill="FFFFFF"/>
+          </w:tcPr>
+          <w:p>
+            <w:r>
+              <w:rPr>
+                <w:rFonts w:ascii="Lato" w:hAnsi="Lato"/>
+                <w:color w:val="515151"/>
+                <w:sz w:val="19"/>
+              </w:rPr>
+              <w:t>Empresa com status = cliente.</w:t>
+            </w:r>
+          </w:p>
+        </w:tc>
+      </w:tr>
+      <w:tr>
+        <w:tc>
+          <w:tcPr>
+            <w:tcW w:type="dxa" w:w="2551"/>
+            <w:shd w:val="clear" w:color="auto" w:fill="EEF3FB"/>
+          </w:tcPr>
+          <w:p>
+            <w:r>
+              <w:rPr>
+                <w:rFonts w:ascii="Lato" w:hAnsi="Lato"/>
+                <w:b/>
+                <w:color w:val="303F63"/>
+                <w:sz w:val="19"/>
+              </w:rPr>
+              <w:t>Ações principais</w:t>
+            </w:r>
+          </w:p>
+        </w:tc>
+        <w:tc>
+          <w:tcPr>
+            <w:tcW w:type="dxa" w:w="7370"/>
+            <w:shd w:val="clear" w:color="auto" w:fill="F5F5F5"/>
+          </w:tcPr>
+          <w:p>
+            <w:r>
+              <w:rPr>
+                <w:rFonts w:ascii="Lato" w:hAnsi="Lato"/>
+                <w:color w:val="515151"/>
+                <w:sz w:val="19"/>
+              </w:rPr>
+              <w:t>Cria um registro de Portfólio associado à Empresa.</w:t>
+            </w:r>
+          </w:p>
+        </w:tc>
+      </w:tr>
+      <w:tr>
+        <w:tc>
+          <w:tcPr>
+            <w:tcW w:type="dxa" w:w="2551"/>
+            <w:shd w:val="clear" w:color="auto" w:fill="EEF3FB"/>
+          </w:tcPr>
+          <w:p>
+            <w:r>
+              <w:rPr>
+                <w:rFonts w:ascii="Lato" w:hAnsi="Lato"/>
+                <w:b/>
+                <w:color w:val="303F63"/>
+                <w:sz w:val="19"/>
+              </w:rPr>
+              <w:t>Dependências</w:t>
+            </w:r>
+          </w:p>
+        </w:tc>
+        <w:tc>
+          <w:tcPr>
+            <w:tcW w:type="dxa" w:w="7370"/>
+            <w:shd w:val="clear" w:color="auto" w:fill="FFFFFF"/>
+          </w:tcPr>
+          <w:p>
+            <w:r>
+              <w:rPr>
+                <w:rFonts w:ascii="Lato" w:hAnsi="Lato"/>
+                <w:color w:val="515151"/>
+                <w:sz w:val="19"/>
+              </w:rPr>
+              <w:t>Pré-condição para os demais workflows do cluster Portfólio.</w:t>
+            </w:r>
+          </w:p>
+        </w:tc>
+      </w:tr>
+    </w:tbl>
+    <w:p/>
+    <w:p>
+      <w:r>
+        <w:rPr>
+          <w:rFonts w:ascii="Lato" w:hAnsi="Lato"/>
+          <w:b/>
+          <w:color w:val="303F63"/>
+          <w:sz w:val="22"/>
+        </w:rPr>
+        <w:t>Workflow: [02.03 - Portfólio] Grupo de contrato = Criado → Associa a Portfólio</w:t>
+      </w:r>
+    </w:p>
+    <w:tbl>
+      <w:tblPr>
+        <w:tblStyle w:val="TableGrid"/>
+        <w:tblW w:type="auto" w:w="0"/>
+        <w:tblLook w:firstColumn="1" w:firstRow="1" w:lastColumn="0" w:lastRow="0" w:noHBand="0" w:noVBand="1" w:val="04A0"/>
+      </w:tblPr>
+      <w:tblGrid>
+        <w:gridCol w:w="4561"/>
+        <w:gridCol w:w="4561"/>
+      </w:tblGrid>
+      <w:tr>
+        <w:tc>
+          <w:tcPr>
+            <w:tcW w:type="dxa" w:w="2551"/>
+            <w:shd w:val="clear" w:color="auto" w:fill="EEF3FB"/>
+          </w:tcPr>
+          <w:p>
+            <w:r>
+              <w:rPr>
+                <w:rFonts w:ascii="Lato" w:hAnsi="Lato"/>
+                <w:b/>
+                <w:color w:val="303F63"/>
+                <w:sz w:val="19"/>
+              </w:rPr>
+              <w:t>ID</w:t>
+            </w:r>
+          </w:p>
+        </w:tc>
+        <w:tc>
+          <w:tcPr>
+            <w:tcW w:type="dxa" w:w="7370"/>
+            <w:shd w:val="clear" w:color="auto" w:fill="FFFFFF"/>
+          </w:tcPr>
+          <w:p>
+            <w:r>
+              <w:rPr>
+                <w:rFonts w:ascii="Lato" w:hAnsi="Lato"/>
+                <w:color w:val="515151"/>
+                <w:sz w:val="19"/>
+              </w:rPr>
+              <w:t>1769330228</w:t>
+            </w:r>
+          </w:p>
+        </w:tc>
+      </w:tr>
+      <w:tr>
+        <w:tc>
+          <w:tcPr>
+            <w:tcW w:type="dxa" w:w="2551"/>
+            <w:shd w:val="clear" w:color="auto" w:fill="EEF3FB"/>
+          </w:tcPr>
+          <w:p>
+            <w:r>
+              <w:rPr>
+                <w:rFonts w:ascii="Lato" w:hAnsi="Lato"/>
+                <w:b/>
+                <w:color w:val="303F63"/>
+                <w:sz w:val="19"/>
+              </w:rPr>
+              <w:t>Objetivo</w:t>
+            </w:r>
+          </w:p>
+        </w:tc>
+        <w:tc>
+          <w:tcPr>
+            <w:tcW w:type="dxa" w:w="7370"/>
+            <w:shd w:val="clear" w:color="auto" w:fill="F5F5F5"/>
+          </w:tcPr>
+          <w:p>
+            <w:r>
+              <w:rPr>
+                <w:rFonts w:ascii="Lato" w:hAnsi="Lato"/>
+                <w:color w:val="515151"/>
+                <w:sz w:val="19"/>
+              </w:rPr>
+              <w:t>Garantir que cada Grupo de Contrato criado seja associado ao Portfólio correto da Empresa.</w:t>
+            </w:r>
+          </w:p>
+        </w:tc>
+      </w:tr>
+      <w:tr>
+        <w:tc>
+          <w:tcPr>
+            <w:tcW w:type="dxa" w:w="2551"/>
+            <w:shd w:val="clear" w:color="auto" w:fill="EEF3FB"/>
+          </w:tcPr>
+          <w:p>
+            <w:r>
+              <w:rPr>
+                <w:rFonts w:ascii="Lato" w:hAnsi="Lato"/>
+                <w:b/>
+                <w:color w:val="303F63"/>
+                <w:sz w:val="19"/>
+              </w:rPr>
+              <w:t>Status</w:t>
+            </w:r>
+          </w:p>
+        </w:tc>
+        <w:tc>
+          <w:tcPr>
+            <w:tcW w:type="dxa" w:w="7370"/>
+            <w:shd w:val="clear" w:color="auto" w:fill="FFFFFF"/>
+          </w:tcPr>
+          <w:p>
+            <w:r>
+              <w:rPr>
+                <w:rFonts w:ascii="Lato" w:hAnsi="Lato"/>
+                <w:color w:val="515151"/>
+                <w:sz w:val="19"/>
+              </w:rPr>
+              <w:t>Ativo</w:t>
+            </w:r>
+          </w:p>
+        </w:tc>
+      </w:tr>
+      <w:tr>
+        <w:tc>
+          <w:tcPr>
+            <w:tcW w:type="dxa" w:w="2551"/>
+            <w:shd w:val="clear" w:color="auto" w:fill="EEF3FB"/>
+          </w:tcPr>
+          <w:p>
+            <w:r>
+              <w:rPr>
+                <w:rFonts w:ascii="Lato" w:hAnsi="Lato"/>
+                <w:b/>
+                <w:color w:val="303F63"/>
+                <w:sz w:val="19"/>
+              </w:rPr>
+              <w:t>Objeto HubSpot</w:t>
+            </w:r>
+          </w:p>
+        </w:tc>
+        <w:tc>
+          <w:tcPr>
+            <w:tcW w:type="dxa" w:w="7370"/>
+            <w:shd w:val="clear" w:color="auto" w:fill="F5F5F5"/>
+          </w:tcPr>
+          <w:p>
+            <w:r>
+              <w:rPr>
+                <w:rFonts w:ascii="Lato" w:hAnsi="Lato"/>
+                <w:color w:val="515151"/>
+                <w:sz w:val="19"/>
+              </w:rPr>
+              <w:t>Grupo de Contrato (2-54707985)</w:t>
+            </w:r>
+          </w:p>
+        </w:tc>
+      </w:tr>
+      <w:tr>
+        <w:tc>
+          <w:tcPr>
+            <w:tcW w:type="dxa" w:w="2551"/>
+            <w:shd w:val="clear" w:color="auto" w:fill="EEF3FB"/>
+          </w:tcPr>
+          <w:p>
+            <w:r>
+              <w:rPr>
+                <w:rFonts w:ascii="Lato" w:hAnsi="Lato"/>
+                <w:b/>
+                <w:color w:val="303F63"/>
+                <w:sz w:val="19"/>
+              </w:rPr>
+              <w:t>Disparo</w:t>
+            </w:r>
+          </w:p>
+        </w:tc>
+        <w:tc>
+          <w:tcPr>
+            <w:tcW w:type="dxa" w:w="7370"/>
+            <w:shd w:val="clear" w:color="auto" w:fill="FFFFFF"/>
+          </w:tcPr>
+          <w:p>
+            <w:r>
+              <w:rPr>
+                <w:rFonts w:ascii="Lato" w:hAnsi="Lato"/>
+                <w:color w:val="515151"/>
+                <w:sz w:val="19"/>
+              </w:rPr>
+              <w:t>Criação de Grupo de Contrato.</w:t>
+            </w:r>
+          </w:p>
+        </w:tc>
+      </w:tr>
+      <w:tr>
+        <w:tc>
+          <w:tcPr>
+            <w:tcW w:type="dxa" w:w="2551"/>
+            <w:shd w:val="clear" w:color="auto" w:fill="EEF3FB"/>
+          </w:tcPr>
+          <w:p>
+            <w:r>
+              <w:rPr>
+                <w:rFonts w:ascii="Lato" w:hAnsi="Lato"/>
+                <w:b/>
+                <w:color w:val="303F63"/>
+                <w:sz w:val="19"/>
+              </w:rPr>
+              <w:t>Ações principais</w:t>
+            </w:r>
+          </w:p>
+        </w:tc>
+        <w:tc>
+          <w:tcPr>
+            <w:tcW w:type="dxa" w:w="7370"/>
+            <w:shd w:val="clear" w:color="auto" w:fill="F5F5F5"/>
+          </w:tcPr>
+          <w:p>
+            <w:r>
+              <w:rPr>
+                <w:rFonts w:ascii="Lato" w:hAnsi="Lato"/>
+                <w:color w:val="515151"/>
+                <w:sz w:val="19"/>
+              </w:rPr>
+              <w:t>Associa o GC ao Portfólio da Empresa vinculada.</w:t>
+            </w:r>
+          </w:p>
+        </w:tc>
+      </w:tr>
+      <w:tr>
+        <w:tc>
+          <w:tcPr>
+            <w:tcW w:type="dxa" w:w="2551"/>
+            <w:shd w:val="clear" w:color="auto" w:fill="EEF3FB"/>
+          </w:tcPr>
+          <w:p>
+            <w:r>
+              <w:rPr>
+                <w:rFonts w:ascii="Lato" w:hAnsi="Lato"/>
+                <w:b/>
+                <w:color w:val="303F63"/>
+                <w:sz w:val="19"/>
+              </w:rPr>
+              <w:t>Dependências</w:t>
+            </w:r>
+          </w:p>
+        </w:tc>
+        <w:tc>
+          <w:tcPr>
+            <w:tcW w:type="dxa" w:w="7370"/>
+            <w:shd w:val="clear" w:color="auto" w:fill="FFFFFF"/>
+          </w:tcPr>
+          <w:p>
+            <w:r>
+              <w:rPr>
+                <w:rFonts w:ascii="Lato" w:hAnsi="Lato"/>
+                <w:color w:val="515151"/>
+                <w:sz w:val="19"/>
+              </w:rPr>
+              <w:t>Requer que o Portfólio da Empresa já exista ([01 - Portfólio]).</w:t>
+            </w:r>
+          </w:p>
+        </w:tc>
+      </w:tr>
+    </w:tbl>
+    <w:p/>
+    <w:p>
+      <w:r>
+        <w:rPr>
+          <w:rFonts w:ascii="Lato" w:hAnsi="Lato"/>
+          <w:b/>
+          <w:color w:val="303F63"/>
+          <w:sz w:val="22"/>
+        </w:rPr>
+        <w:t>Workflow: [03.01 - Portfólio] Item de linha = Atualizado → Atualiza Portfólio</w:t>
+      </w:r>
+    </w:p>
+    <w:tbl>
+      <w:tblPr>
+        <w:tblStyle w:val="TableGrid"/>
+        <w:tblW w:type="auto" w:w="0"/>
+        <w:tblLook w:firstColumn="1" w:firstRow="1" w:lastColumn="0" w:lastRow="0" w:noHBand="0" w:noVBand="1" w:val="04A0"/>
+      </w:tblPr>
+      <w:tblGrid>
+        <w:gridCol w:w="4561"/>
+        <w:gridCol w:w="4561"/>
+      </w:tblGrid>
+      <w:tr>
+        <w:tc>
+          <w:tcPr>
+            <w:tcW w:type="dxa" w:w="2551"/>
+            <w:shd w:val="clear" w:color="auto" w:fill="EEF3FB"/>
+          </w:tcPr>
+          <w:p>
+            <w:r>
+              <w:rPr>
+                <w:rFonts w:ascii="Lato" w:hAnsi="Lato"/>
+                <w:b/>
+                <w:color w:val="303F63"/>
+                <w:sz w:val="19"/>
+              </w:rPr>
+              <w:t>ID</w:t>
+            </w:r>
+          </w:p>
+        </w:tc>
+        <w:tc>
+          <w:tcPr>
+            <w:tcW w:type="dxa" w:w="7370"/>
+            <w:shd w:val="clear" w:color="auto" w:fill="FFFFFF"/>
+          </w:tcPr>
+          <w:p>
+            <w:r>
+              <w:rPr>
+                <w:rFonts w:ascii="Lato" w:hAnsi="Lato"/>
+                <w:color w:val="515151"/>
+                <w:sz w:val="19"/>
+              </w:rPr>
+              <w:t>1769611663</w:t>
+            </w:r>
+          </w:p>
+        </w:tc>
+      </w:tr>
+      <w:tr>
+        <w:tc>
+          <w:tcPr>
+            <w:tcW w:type="dxa" w:w="2551"/>
+            <w:shd w:val="clear" w:color="auto" w:fill="EEF3FB"/>
+          </w:tcPr>
+          <w:p>
+            <w:r>
+              <w:rPr>
+                <w:rFonts w:ascii="Lato" w:hAnsi="Lato"/>
+                <w:b/>
+                <w:color w:val="303F63"/>
+                <w:sz w:val="19"/>
+              </w:rPr>
+              <w:t>Objetivo</w:t>
+            </w:r>
+          </w:p>
+        </w:tc>
+        <w:tc>
+          <w:tcPr>
+            <w:tcW w:type="dxa" w:w="7370"/>
+            <w:shd w:val="clear" w:color="auto" w:fill="F5F5F5"/>
+          </w:tcPr>
+          <w:p>
+            <w:r>
+              <w:rPr>
+                <w:rFonts w:ascii="Lato" w:hAnsi="Lato"/>
+                <w:color w:val="515151"/>
+                <w:sz w:val="19"/>
+              </w:rPr>
+              <w:t>Propagar as atualizações de itens de linha do GC para o Portfólio associado após cada sync Oracle.</w:t>
+            </w:r>
+          </w:p>
+        </w:tc>
+      </w:tr>
+      <w:tr>
+        <w:tc>
+          <w:tcPr>
+            <w:tcW w:type="dxa" w:w="2551"/>
+            <w:shd w:val="clear" w:color="auto" w:fill="EEF3FB"/>
+          </w:tcPr>
+          <w:p>
+            <w:r>
+              <w:rPr>
+                <w:rFonts w:ascii="Lato" w:hAnsi="Lato"/>
+                <w:b/>
+                <w:color w:val="303F63"/>
+                <w:sz w:val="19"/>
+              </w:rPr>
+              <w:t>Status</w:t>
+            </w:r>
+          </w:p>
+        </w:tc>
+        <w:tc>
+          <w:tcPr>
+            <w:tcW w:type="dxa" w:w="7370"/>
+            <w:shd w:val="clear" w:color="auto" w:fill="FFFFFF"/>
+          </w:tcPr>
+          <w:p>
+            <w:r>
+              <w:rPr>
+                <w:rFonts w:ascii="Lato" w:hAnsi="Lato"/>
+                <w:color w:val="515151"/>
+                <w:sz w:val="19"/>
+              </w:rPr>
+              <w:t>Desabilitado</w:t>
+            </w:r>
+          </w:p>
+        </w:tc>
+      </w:tr>
+      <w:tr>
+        <w:tc>
+          <w:tcPr>
+            <w:tcW w:type="dxa" w:w="2551"/>
+            <w:shd w:val="clear" w:color="auto" w:fill="EEF3FB"/>
+          </w:tcPr>
+          <w:p>
+            <w:r>
+              <w:rPr>
+                <w:rFonts w:ascii="Lato" w:hAnsi="Lato"/>
+                <w:b/>
+                <w:color w:val="303F63"/>
+                <w:sz w:val="19"/>
+              </w:rPr>
+              <w:t>Objeto HubSpot</w:t>
+            </w:r>
+          </w:p>
+        </w:tc>
+        <w:tc>
+          <w:tcPr>
+            <w:tcW w:type="dxa" w:w="7370"/>
+            <w:shd w:val="clear" w:color="auto" w:fill="F5F5F5"/>
+          </w:tcPr>
+          <w:p>
+            <w:r>
+              <w:rPr>
+                <w:rFonts w:ascii="Lato" w:hAnsi="Lato"/>
+                <w:color w:val="515151"/>
+                <w:sz w:val="19"/>
+              </w:rPr>
+              <w:t>Grupo de Contrato (2-54707985)</w:t>
+            </w:r>
+          </w:p>
+        </w:tc>
+      </w:tr>
+      <w:tr>
+        <w:tc>
+          <w:tcPr>
+            <w:tcW w:type="dxa" w:w="2551"/>
+            <w:shd w:val="clear" w:color="auto" w:fill="EEF3FB"/>
+          </w:tcPr>
+          <w:p>
+            <w:r>
+              <w:rPr>
+                <w:rFonts w:ascii="Lato" w:hAnsi="Lato"/>
+                <w:b/>
+                <w:color w:val="303F63"/>
+                <w:sz w:val="19"/>
+              </w:rPr>
+              <w:t>Disparo</w:t>
+            </w:r>
+          </w:p>
+        </w:tc>
+        <w:tc>
+          <w:tcPr>
+            <w:tcW w:type="dxa" w:w="7370"/>
+            <w:shd w:val="clear" w:color="auto" w:fill="FFFFFF"/>
+          </w:tcPr>
+          <w:p>
+            <w:r>
+              <w:rPr>
+                <w:rFonts w:ascii="Lato" w:hAnsi="Lato"/>
+                <w:color w:val="515151"/>
+                <w:sz w:val="19"/>
+              </w:rPr>
+              <w:t>Atualização de item de linha no GC.</w:t>
+            </w:r>
+          </w:p>
+        </w:tc>
+      </w:tr>
+      <w:tr>
+        <w:tc>
+          <w:tcPr>
+            <w:tcW w:type="dxa" w:w="2551"/>
+            <w:shd w:val="clear" w:color="auto" w:fill="EEF3FB"/>
+          </w:tcPr>
+          <w:p>
+            <w:r>
+              <w:rPr>
+                <w:rFonts w:ascii="Lato" w:hAnsi="Lato"/>
+                <w:b/>
+                <w:color w:val="303F63"/>
+                <w:sz w:val="19"/>
+              </w:rPr>
+              <w:t>Ações principais</w:t>
+            </w:r>
+          </w:p>
+        </w:tc>
+        <w:tc>
+          <w:tcPr>
+            <w:tcW w:type="dxa" w:w="7370"/>
+            <w:shd w:val="clear" w:color="auto" w:fill="F5F5F5"/>
+          </w:tcPr>
+          <w:p>
+            <w:r>
+              <w:rPr>
+                <w:rFonts w:ascii="Lato" w:hAnsi="Lato"/>
+                <w:color w:val="515151"/>
+                <w:sz w:val="19"/>
+              </w:rPr>
+              <w:t>Atualiza o Portfólio com os novos valores dos itens de linha do GC.</w:t>
+            </w:r>
+          </w:p>
+        </w:tc>
+      </w:tr>
+      <w:tr>
+        <w:tc>
+          <w:tcPr>
+            <w:tcW w:type="dxa" w:w="2551"/>
+            <w:shd w:val="clear" w:color="auto" w:fill="EEF3FB"/>
+          </w:tcPr>
+          <w:p>
+            <w:r>
+              <w:rPr>
+                <w:rFonts w:ascii="Lato" w:hAnsi="Lato"/>
+                <w:b/>
+                <w:color w:val="303F63"/>
+                <w:sz w:val="19"/>
+              </w:rPr>
+              <w:t>Dependências</w:t>
+            </w:r>
+          </w:p>
+        </w:tc>
+        <w:tc>
+          <w:tcPr>
+            <w:tcW w:type="dxa" w:w="7370"/>
+            <w:shd w:val="clear" w:color="auto" w:fill="FFFFFF"/>
+          </w:tcPr>
+          <w:p>
+            <w:r>
+              <w:rPr>
+                <w:rFonts w:ascii="Lato" w:hAnsi="Lato"/>
+                <w:color w:val="515151"/>
+                <w:sz w:val="19"/>
+              </w:rPr>
+              <w:t>Depende do Split workflow ter reconstruído os itens de linha do GC. Ver PV-07.</w:t>
+            </w:r>
+          </w:p>
+        </w:tc>
+      </w:tr>
+    </w:tbl>
+    <w:p/>
+    <w:p>
+      <w:r>
+        <w:rPr>
+          <w:rFonts w:ascii="Lato" w:hAnsi="Lato"/>
+          <w:b/>
+          <w:color w:val="303F63"/>
+          <w:sz w:val="22"/>
+        </w:rPr>
+        <w:t>Workflow: [04.01 - Portfólio] Item de linha = Adicionado → Unifica Portfólio</w:t>
+      </w:r>
+    </w:p>
+    <w:tbl>
+      <w:tblPr>
+        <w:tblStyle w:val="TableGrid"/>
+        <w:tblW w:type="auto" w:w="0"/>
+        <w:tblLook w:firstColumn="1" w:firstRow="1" w:lastColumn="0" w:lastRow="0" w:noHBand="0" w:noVBand="1" w:val="04A0"/>
+      </w:tblPr>
+      <w:tblGrid>
+        <w:gridCol w:w="4561"/>
+        <w:gridCol w:w="4561"/>
+      </w:tblGrid>
+      <w:tr>
+        <w:tc>
+          <w:tcPr>
+            <w:tcW w:type="dxa" w:w="2551"/>
+            <w:shd w:val="clear" w:color="auto" w:fill="EEF3FB"/>
+          </w:tcPr>
+          <w:p>
+            <w:r>
+              <w:rPr>
+                <w:rFonts w:ascii="Lato" w:hAnsi="Lato"/>
+                <w:b/>
+                <w:color w:val="303F63"/>
+                <w:sz w:val="19"/>
+              </w:rPr>
+              <w:t>ID</w:t>
+            </w:r>
+          </w:p>
+        </w:tc>
+        <w:tc>
+          <w:tcPr>
+            <w:tcW w:type="dxa" w:w="7370"/>
+            <w:shd w:val="clear" w:color="auto" w:fill="FFFFFF"/>
+          </w:tcPr>
+          <w:p>
+            <w:r>
+              <w:rPr>
+                <w:rFonts w:ascii="Lato" w:hAnsi="Lato"/>
+                <w:color w:val="515151"/>
+                <w:sz w:val="19"/>
+              </w:rPr>
+              <w:t>1769641515</w:t>
+            </w:r>
+          </w:p>
+        </w:tc>
+      </w:tr>
+      <w:tr>
+        <w:tc>
+          <w:tcPr>
+            <w:tcW w:type="dxa" w:w="2551"/>
+            <w:shd w:val="clear" w:color="auto" w:fill="EEF3FB"/>
+          </w:tcPr>
+          <w:p>
+            <w:r>
+              <w:rPr>
+                <w:rFonts w:ascii="Lato" w:hAnsi="Lato"/>
+                <w:b/>
+                <w:color w:val="303F63"/>
+                <w:sz w:val="19"/>
+              </w:rPr>
+              <w:t>Objetivo</w:t>
+            </w:r>
+          </w:p>
+        </w:tc>
+        <w:tc>
+          <w:tcPr>
+            <w:tcW w:type="dxa" w:w="7370"/>
+            <w:shd w:val="clear" w:color="auto" w:fill="F5F5F5"/>
+          </w:tcPr>
+          <w:p>
+            <w:r>
+              <w:rPr>
+                <w:rFonts w:ascii="Lato" w:hAnsi="Lato"/>
+                <w:color w:val="515151"/>
+                <w:sz w:val="19"/>
+              </w:rPr>
+              <w:t>Consolidar no Portfólio os itens de linha adicionados, garantindo visão unificada do portfólio do cliente.</w:t>
+            </w:r>
+          </w:p>
+        </w:tc>
+      </w:tr>
+      <w:tr>
+        <w:tc>
+          <w:tcPr>
+            <w:tcW w:type="dxa" w:w="2551"/>
+            <w:shd w:val="clear" w:color="auto" w:fill="EEF3FB"/>
+          </w:tcPr>
+          <w:p>
+            <w:r>
+              <w:rPr>
+                <w:rFonts w:ascii="Lato" w:hAnsi="Lato"/>
+                <w:b/>
+                <w:color w:val="303F63"/>
+                <w:sz w:val="19"/>
+              </w:rPr>
+              <w:t>Status</w:t>
+            </w:r>
+          </w:p>
+        </w:tc>
+        <w:tc>
+          <w:tcPr>
+            <w:tcW w:type="dxa" w:w="7370"/>
+            <w:shd w:val="clear" w:color="auto" w:fill="FFFFFF"/>
+          </w:tcPr>
+          <w:p>
+            <w:r>
+              <w:rPr>
+                <w:rFonts w:ascii="Lato" w:hAnsi="Lato"/>
+                <w:color w:val="515151"/>
+                <w:sz w:val="19"/>
+              </w:rPr>
+              <w:t>Ativo</w:t>
+            </w:r>
+          </w:p>
+        </w:tc>
+      </w:tr>
+      <w:tr>
+        <w:tc>
+          <w:tcPr>
+            <w:tcW w:type="dxa" w:w="2551"/>
+            <w:shd w:val="clear" w:color="auto" w:fill="EEF3FB"/>
+          </w:tcPr>
+          <w:p>
+            <w:r>
+              <w:rPr>
+                <w:rFonts w:ascii="Lato" w:hAnsi="Lato"/>
+                <w:b/>
+                <w:color w:val="303F63"/>
+                <w:sz w:val="19"/>
+              </w:rPr>
+              <w:t>Objeto HubSpot</w:t>
+            </w:r>
+          </w:p>
+        </w:tc>
+        <w:tc>
+          <w:tcPr>
+            <w:tcW w:type="dxa" w:w="7370"/>
+            <w:shd w:val="clear" w:color="auto" w:fill="F5F5F5"/>
+          </w:tcPr>
+          <w:p>
+            <w:r>
+              <w:rPr>
+                <w:rFonts w:ascii="Lato" w:hAnsi="Lato"/>
+                <w:color w:val="515151"/>
+                <w:sz w:val="19"/>
+              </w:rPr>
+              <w:t>Portfólio (2-54708014)</w:t>
+            </w:r>
+          </w:p>
+        </w:tc>
+      </w:tr>
+      <w:tr>
+        <w:tc>
+          <w:tcPr>
+            <w:tcW w:type="dxa" w:w="2551"/>
+            <w:shd w:val="clear" w:color="auto" w:fill="EEF3FB"/>
+          </w:tcPr>
+          <w:p>
+            <w:r>
+              <w:rPr>
+                <w:rFonts w:ascii="Lato" w:hAnsi="Lato"/>
+                <w:b/>
+                <w:color w:val="303F63"/>
+                <w:sz w:val="19"/>
+              </w:rPr>
+              <w:t>Disparo</w:t>
+            </w:r>
+          </w:p>
+        </w:tc>
+        <w:tc>
+          <w:tcPr>
+            <w:tcW w:type="dxa" w:w="7370"/>
+            <w:shd w:val="clear" w:color="auto" w:fill="FFFFFF"/>
+          </w:tcPr>
+          <w:p>
+            <w:r>
+              <w:rPr>
+                <w:rFonts w:ascii="Lato" w:hAnsi="Lato"/>
+                <w:color w:val="515151"/>
+                <w:sz w:val="19"/>
+              </w:rPr>
+              <w:t>Item de linha adicionado ao Portfólio.</w:t>
+            </w:r>
+          </w:p>
+        </w:tc>
+      </w:tr>
+      <w:tr>
+        <w:tc>
+          <w:tcPr>
+            <w:tcW w:type="dxa" w:w="2551"/>
+            <w:shd w:val="clear" w:color="auto" w:fill="EEF3FB"/>
+          </w:tcPr>
+          <w:p>
+            <w:r>
+              <w:rPr>
+                <w:rFonts w:ascii="Lato" w:hAnsi="Lato"/>
+                <w:b/>
+                <w:color w:val="303F63"/>
+                <w:sz w:val="19"/>
+              </w:rPr>
+              <w:t>Ações principais</w:t>
+            </w:r>
+          </w:p>
+        </w:tc>
+        <w:tc>
+          <w:tcPr>
+            <w:tcW w:type="dxa" w:w="7370"/>
+            <w:shd w:val="clear" w:color="auto" w:fill="F5F5F5"/>
+          </w:tcPr>
+          <w:p>
+            <w:r>
+              <w:rPr>
+                <w:rFonts w:ascii="Lato" w:hAnsi="Lato"/>
+                <w:color w:val="515151"/>
+                <w:sz w:val="19"/>
+              </w:rPr>
+              <w:t>Unifica os itens de linha no Portfólio.</w:t>
+            </w:r>
+          </w:p>
+        </w:tc>
+      </w:tr>
+      <w:tr>
+        <w:tc>
+          <w:tcPr>
+            <w:tcW w:type="dxa" w:w="2551"/>
+            <w:shd w:val="clear" w:color="auto" w:fill="EEF3FB"/>
+          </w:tcPr>
+          <w:p>
+            <w:r>
+              <w:rPr>
+                <w:rFonts w:ascii="Lato" w:hAnsi="Lato"/>
+                <w:b/>
+                <w:color w:val="303F63"/>
+                <w:sz w:val="19"/>
+              </w:rPr>
+              <w:t>Dependências</w:t>
+            </w:r>
+          </w:p>
+        </w:tc>
+        <w:tc>
+          <w:tcPr>
+            <w:tcW w:type="dxa" w:w="7370"/>
+            <w:shd w:val="clear" w:color="auto" w:fill="FFFFFF"/>
+          </w:tcPr>
+          <w:p>
+            <w:r>
+              <w:rPr>
+                <w:rFonts w:ascii="Lato" w:hAnsi="Lato"/>
+                <w:color w:val="515151"/>
+                <w:sz w:val="19"/>
+              </w:rPr>
+              <w:t>Depende da associação GC→Portfólio estar ativa.</w:t>
+            </w:r>
+          </w:p>
+        </w:tc>
+      </w:tr>
+    </w:tbl>
+    <w:p/>
+    <w:p>
+      <w:r>
+        <w:rPr>
+          <w:rFonts w:ascii="Lato" w:hAnsi="Lato"/>
+          <w:b/>
+          <w:color w:val="303F63"/>
+          <w:sz w:val="22"/>
+        </w:rPr>
+        <w:t>Workflow: [04.02 - Portfólio] Item de linha = Atualizado → Preenche MultipleCheckbox</w:t>
+      </w:r>
+    </w:p>
+    <w:tbl>
+      <w:tblPr>
+        <w:tblStyle w:val="TableGrid"/>
+        <w:tblW w:type="auto" w:w="0"/>
+        <w:tblLook w:firstColumn="1" w:firstRow="1" w:lastColumn="0" w:lastRow="0" w:noHBand="0" w:noVBand="1" w:val="04A0"/>
+      </w:tblPr>
+      <w:tblGrid>
+        <w:gridCol w:w="4561"/>
+        <w:gridCol w:w="4561"/>
+      </w:tblGrid>
+      <w:tr>
+        <w:tc>
+          <w:tcPr>
+            <w:tcW w:type="dxa" w:w="2551"/>
+            <w:shd w:val="clear" w:color="auto" w:fill="EEF3FB"/>
+          </w:tcPr>
+          <w:p>
+            <w:r>
+              <w:rPr>
+                <w:rFonts w:ascii="Lato" w:hAnsi="Lato"/>
+                <w:b/>
+                <w:color w:val="303F63"/>
+                <w:sz w:val="19"/>
+              </w:rPr>
+              <w:t>ID</w:t>
+            </w:r>
+          </w:p>
+        </w:tc>
+        <w:tc>
+          <w:tcPr>
+            <w:tcW w:type="dxa" w:w="7370"/>
+            <w:shd w:val="clear" w:color="auto" w:fill="FFFFFF"/>
+          </w:tcPr>
+          <w:p>
+            <w:r>
+              <w:rPr>
+                <w:rFonts w:ascii="Lato" w:hAnsi="Lato"/>
+                <w:color w:val="515151"/>
+                <w:sz w:val="19"/>
+              </w:rPr>
+              <w:t>1769675174</w:t>
+            </w:r>
+          </w:p>
+        </w:tc>
+      </w:tr>
+      <w:tr>
+        <w:tc>
+          <w:tcPr>
+            <w:tcW w:type="dxa" w:w="2551"/>
+            <w:shd w:val="clear" w:color="auto" w:fill="EEF3FB"/>
+          </w:tcPr>
+          <w:p>
+            <w:r>
+              <w:rPr>
+                <w:rFonts w:ascii="Lato" w:hAnsi="Lato"/>
+                <w:b/>
+                <w:color w:val="303F63"/>
+                <w:sz w:val="19"/>
+              </w:rPr>
+              <w:t>Objetivo</w:t>
+            </w:r>
+          </w:p>
+        </w:tc>
+        <w:tc>
+          <w:tcPr>
+            <w:tcW w:type="dxa" w:w="7370"/>
+            <w:shd w:val="clear" w:color="auto" w:fill="F5F5F5"/>
+          </w:tcPr>
+          <w:p>
+            <w:r>
+              <w:rPr>
+                <w:rFonts w:ascii="Lato" w:hAnsi="Lato"/>
+                <w:color w:val="515151"/>
+                <w:sz w:val="19"/>
+              </w:rPr>
+              <w:t>Manter os campos de múltipla seleção do Portfólio atualizados com base nos itens de linha existentes.</w:t>
+            </w:r>
+          </w:p>
+        </w:tc>
+      </w:tr>
+      <w:tr>
+        <w:tc>
+          <w:tcPr>
+            <w:tcW w:type="dxa" w:w="2551"/>
+            <w:shd w:val="clear" w:color="auto" w:fill="EEF3FB"/>
+          </w:tcPr>
+          <w:p>
+            <w:r>
+              <w:rPr>
+                <w:rFonts w:ascii="Lato" w:hAnsi="Lato"/>
+                <w:b/>
+                <w:color w:val="303F63"/>
+                <w:sz w:val="19"/>
+              </w:rPr>
+              <w:t>Status</w:t>
+            </w:r>
+          </w:p>
+        </w:tc>
+        <w:tc>
+          <w:tcPr>
+            <w:tcW w:type="dxa" w:w="7370"/>
+            <w:shd w:val="clear" w:color="auto" w:fill="FFFFFF"/>
+          </w:tcPr>
+          <w:p>
+            <w:r>
+              <w:rPr>
+                <w:rFonts w:ascii="Lato" w:hAnsi="Lato"/>
+                <w:color w:val="515151"/>
+                <w:sz w:val="19"/>
+              </w:rPr>
+              <w:t>Ativo</w:t>
+            </w:r>
+          </w:p>
+        </w:tc>
+      </w:tr>
+      <w:tr>
+        <w:tc>
+          <w:tcPr>
+            <w:tcW w:type="dxa" w:w="2551"/>
+            <w:shd w:val="clear" w:color="auto" w:fill="EEF3FB"/>
+          </w:tcPr>
+          <w:p>
+            <w:r>
+              <w:rPr>
+                <w:rFonts w:ascii="Lato" w:hAnsi="Lato"/>
+                <w:b/>
+                <w:color w:val="303F63"/>
+                <w:sz w:val="19"/>
+              </w:rPr>
+              <w:t>Objeto HubSpot</w:t>
+            </w:r>
+          </w:p>
+        </w:tc>
+        <w:tc>
+          <w:tcPr>
+            <w:tcW w:type="dxa" w:w="7370"/>
+            <w:shd w:val="clear" w:color="auto" w:fill="F5F5F5"/>
+          </w:tcPr>
+          <w:p>
+            <w:r>
+              <w:rPr>
+                <w:rFonts w:ascii="Lato" w:hAnsi="Lato"/>
+                <w:color w:val="515151"/>
+                <w:sz w:val="19"/>
+              </w:rPr>
+              <w:t>Portfólio (2-54708014)</w:t>
+            </w:r>
+          </w:p>
+        </w:tc>
+      </w:tr>
+      <w:tr>
+        <w:tc>
+          <w:tcPr>
+            <w:tcW w:type="dxa" w:w="2551"/>
+            <w:shd w:val="clear" w:color="auto" w:fill="EEF3FB"/>
+          </w:tcPr>
+          <w:p>
+            <w:r>
+              <w:rPr>
+                <w:rFonts w:ascii="Lato" w:hAnsi="Lato"/>
+                <w:b/>
+                <w:color w:val="303F63"/>
+                <w:sz w:val="19"/>
+              </w:rPr>
+              <w:t>Disparo</w:t>
+            </w:r>
+          </w:p>
+        </w:tc>
+        <w:tc>
+          <w:tcPr>
+            <w:tcW w:type="dxa" w:w="7370"/>
+            <w:shd w:val="clear" w:color="auto" w:fill="FFFFFF"/>
+          </w:tcPr>
+          <w:p>
+            <w:r>
+              <w:rPr>
+                <w:rFonts w:ascii="Lato" w:hAnsi="Lato"/>
+                <w:color w:val="515151"/>
+                <w:sz w:val="19"/>
+              </w:rPr>
+              <w:t>Atualização de item de linha no Portfólio.</w:t>
+            </w:r>
+          </w:p>
+        </w:tc>
+      </w:tr>
+      <w:tr>
+        <w:tc>
+          <w:tcPr>
+            <w:tcW w:type="dxa" w:w="2551"/>
+            <w:shd w:val="clear" w:color="auto" w:fill="EEF3FB"/>
+          </w:tcPr>
+          <w:p>
+            <w:r>
+              <w:rPr>
+                <w:rFonts w:ascii="Lato" w:hAnsi="Lato"/>
+                <w:b/>
+                <w:color w:val="303F63"/>
+                <w:sz w:val="19"/>
+              </w:rPr>
+              <w:t>Ações principais</w:t>
+            </w:r>
+          </w:p>
+        </w:tc>
+        <w:tc>
+          <w:tcPr>
+            <w:tcW w:type="dxa" w:w="7370"/>
+            <w:shd w:val="clear" w:color="auto" w:fill="F5F5F5"/>
+          </w:tcPr>
+          <w:p>
+            <w:r>
+              <w:rPr>
+                <w:rFonts w:ascii="Lato" w:hAnsi="Lato"/>
+                <w:color w:val="515151"/>
+                <w:sz w:val="19"/>
+              </w:rPr>
+              <w:t>Preenche propriedades MultipleCheckbox do Portfólio com base nos itens de linha atualizados.</w:t>
+            </w:r>
+          </w:p>
+        </w:tc>
+      </w:tr>
+      <w:tr>
+        <w:tc>
+          <w:tcPr>
+            <w:tcW w:type="dxa" w:w="2551"/>
+            <w:shd w:val="clear" w:color="auto" w:fill="EEF3FB"/>
+          </w:tcPr>
+          <w:p>
+            <w:r>
+              <w:rPr>
+                <w:rFonts w:ascii="Lato" w:hAnsi="Lato"/>
+                <w:b/>
+                <w:color w:val="303F63"/>
+                <w:sz w:val="19"/>
+              </w:rPr>
+              <w:t>Dependências</w:t>
+            </w:r>
+          </w:p>
+        </w:tc>
+        <w:tc>
+          <w:tcPr>
+            <w:tcW w:type="dxa" w:w="7370"/>
+            <w:shd w:val="clear" w:color="auto" w:fill="FFFFFF"/>
+          </w:tcPr>
+          <w:p>
+            <w:r>
+              <w:rPr>
+                <w:rFonts w:ascii="Lato" w:hAnsi="Lato"/>
+                <w:color w:val="515151"/>
+                <w:sz w:val="19"/>
+              </w:rPr>
+              <w:t>Depende de itens de linha estarem associados ao Portfólio.</w:t>
             </w:r>
           </w:p>
         </w:tc>
@@ -4906,6 +7409,234 @@
         <w:t>4.4 Integração Oracle</w:t>
       </w:r>
     </w:p>
+    <w:p>
+      <w:r>
+        <w:rPr>
+          <w:rFonts w:ascii="Lato" w:hAnsi="Lato"/>
+          <w:b/>
+          <w:i w:val="0"/>
+          <w:color w:val="303F63"/>
+          <w:sz w:val="22"/>
+        </w:rPr>
+        <w:t>Visão geral da integração</w:t>
+      </w:r>
+    </w:p>
+    <w:tbl>
+      <w:tblPr>
+        <w:tblW w:type="auto" w:w="0"/>
+        <w:tblLook w:firstColumn="1" w:firstRow="1" w:lastColumn="0" w:lastRow="0" w:noHBand="0" w:noVBand="1" w:val="04A0"/>
+      </w:tblPr>
+      <w:tblGrid>
+        <w:gridCol w:w="4561"/>
+        <w:gridCol w:w="4561"/>
+      </w:tblGrid>
+      <w:tr>
+        <w:trPr>
+          <w:cantSplit/>
+        </w:trPr>
+        <w:tc>
+          <w:tcPr>
+            <w:tcW w:type="dxa" w:w="2268"/>
+            <w:shd w:val="clear" w:color="auto" w:fill="0C0E0E"/>
+            <w:vAlign w:val="center"/>
+          </w:tcPr>
+          <w:p>
+            <w:r>
+              <w:rPr>
+                <w:rFonts w:ascii="Lato" w:hAnsi="Lato"/>
+                <w:b/>
+                <w:color w:val="FFFFFF"/>
+                <w:sz w:val="20"/>
+              </w:rPr>
+              <w:t>Dimensão</w:t>
+            </w:r>
+          </w:p>
+        </w:tc>
+        <w:tc>
+          <w:tcPr>
+            <w:tcW w:type="dxa" w:w="7654"/>
+            <w:shd w:val="clear" w:color="auto" w:fill="0C0E0E"/>
+            <w:vAlign w:val="center"/>
+          </w:tcPr>
+          <w:p>
+            <w:r>
+              <w:rPr>
+                <w:rFonts w:ascii="Lato" w:hAnsi="Lato"/>
+                <w:b/>
+                <w:color w:val="FFFFFF"/>
+                <w:sz w:val="20"/>
+              </w:rPr>
+              <w:t>Detalhe</w:t>
+            </w:r>
+          </w:p>
+        </w:tc>
+      </w:tr>
+      <w:tr>
+        <w:trPr>
+          <w:cantSplit/>
+        </w:trPr>
+        <w:tc>
+          <w:tcPr>
+            <w:tcW w:type="dxa" w:w="2268"/>
+            <w:shd w:val="clear" w:color="auto" w:fill="FFFFFF"/>
+            <w:vAlign w:val="center"/>
+          </w:tcPr>
+          <w:p>
+            <w:r>
+              <w:rPr>
+                <w:rFonts w:ascii="Lato" w:hAnsi="Lato"/>
+                <w:b w:val="0"/>
+                <w:color w:val="515151"/>
+                <w:sz w:val="20"/>
+              </w:rPr>
+              <w:t>Entrada</w:t>
+            </w:r>
+          </w:p>
+        </w:tc>
+        <w:tc>
+          <w:tcPr>
+            <w:tcW w:type="dxa" w:w="7654"/>
+            <w:shd w:val="clear" w:color="auto" w:fill="FFFFFF"/>
+            <w:vAlign w:val="center"/>
+          </w:tcPr>
+          <w:p>
+            <w:r>
+              <w:rPr>
+                <w:rFonts w:ascii="Lato" w:hAnsi="Lato"/>
+                <w:b w:val="0"/>
+                <w:color w:val="515151"/>
+                <w:sz w:val="20"/>
+              </w:rPr>
+              <w:t>Dados Oracle via API REST consumida diariamente: nr_contrato, lin_servico (código), lin_servico_desc (texto), prog_qtd (valor) por cliente/contrato. Autenticação via POST com ORACLE_USERNAME / ORACLE_PASSWORD.</w:t>
+            </w:r>
+          </w:p>
+        </w:tc>
+      </w:tr>
+      <w:tr>
+        <w:trPr>
+          <w:cantSplit/>
+        </w:trPr>
+        <w:tc>
+          <w:tcPr>
+            <w:tcW w:type="dxa" w:w="2268"/>
+            <w:shd w:val="clear" w:color="auto" w:fill="F5F5F5"/>
+            <w:vAlign w:val="center"/>
+          </w:tcPr>
+          <w:p>
+            <w:r>
+              <w:rPr>
+                <w:rFonts w:ascii="Lato" w:hAnsi="Lato"/>
+                <w:b w:val="0"/>
+                <w:color w:val="515151"/>
+                <w:sz w:val="20"/>
+              </w:rPr>
+              <w:t>Saída</w:t>
+            </w:r>
+          </w:p>
+        </w:tc>
+        <w:tc>
+          <w:tcPr>
+            <w:tcW w:type="dxa" w:w="7654"/>
+            <w:shd w:val="clear" w:color="auto" w:fill="F5F5F5"/>
+            <w:vAlign w:val="center"/>
+          </w:tcPr>
+          <w:p>
+            <w:r>
+              <w:rPr>
+                <w:rFonts w:ascii="Lato" w:hAnsi="Lato"/>
+                <w:b w:val="0"/>
+                <w:color w:val="515151"/>
+                <w:sz w:val="20"/>
+              </w:rPr>
+              <w:t>Propriedades prog_qtd_* gravadas no Grupo de Contrato correspondente. Itens de linha do GC arquivados (delete-all) e recriados com os valores atualizados a cada execução.</w:t>
+            </w:r>
+          </w:p>
+        </w:tc>
+      </w:tr>
+      <w:tr>
+        <w:trPr>
+          <w:cantSplit/>
+        </w:trPr>
+        <w:tc>
+          <w:tcPr>
+            <w:tcW w:type="dxa" w:w="2268"/>
+            <w:shd w:val="clear" w:color="auto" w:fill="FFFFFF"/>
+            <w:vAlign w:val="center"/>
+          </w:tcPr>
+          <w:p>
+            <w:r>
+              <w:rPr>
+                <w:rFonts w:ascii="Lato" w:hAnsi="Lato"/>
+                <w:b w:val="0"/>
+                <w:color w:val="515151"/>
+                <w:sz w:val="20"/>
+              </w:rPr>
+              <w:t>Objeto impactado</w:t>
+            </w:r>
+          </w:p>
+        </w:tc>
+        <w:tc>
+          <w:tcPr>
+            <w:tcW w:type="dxa" w:w="7654"/>
+            <w:shd w:val="clear" w:color="auto" w:fill="FFFFFF"/>
+            <w:vAlign w:val="center"/>
+          </w:tcPr>
+          <w:p>
+            <w:r>
+              <w:rPr>
+                <w:rFonts w:ascii="Lato" w:hAnsi="Lato"/>
+                <w:b w:val="0"/>
+                <w:color w:val="515151"/>
+                <w:sz w:val="20"/>
+              </w:rPr>
+              <w:t>Grupo de Contrato (2-54707985) — propriedades prog_qtd_* e lin_servico_desc_*. Line Items (0-8) — arquivados e recriados. Portfólio (2-54708014) — via cluster de workflows (condicionado a PV-07).</w:t>
+            </w:r>
+          </w:p>
+        </w:tc>
+      </w:tr>
+      <w:tr>
+        <w:trPr>
+          <w:cantSplit/>
+        </w:trPr>
+        <w:tc>
+          <w:tcPr>
+            <w:tcW w:type="dxa" w:w="2268"/>
+            <w:shd w:val="clear" w:color="auto" w:fill="F5F5F5"/>
+            <w:vAlign w:val="center"/>
+          </w:tcPr>
+          <w:p>
+            <w:r>
+              <w:rPr>
+                <w:rFonts w:ascii="Lato" w:hAnsi="Lato"/>
+                <w:b w:val="0"/>
+                <w:color w:val="515151"/>
+                <w:sz w:val="20"/>
+              </w:rPr>
+              <w:t>Risco principal</w:t>
+            </w:r>
+          </w:p>
+        </w:tc>
+        <w:tc>
+          <w:tcPr>
+            <w:tcW w:type="dxa" w:w="7654"/>
+            <w:shd w:val="clear" w:color="auto" w:fill="F5F5F5"/>
+            <w:vAlign w:val="center"/>
+          </w:tcPr>
+          <w:p>
+            <w:r>
+              <w:rPr>
+                <w:rFonts w:ascii="Lato" w:hAnsi="Lato"/>
+                <w:b w:val="0"/>
+                <w:color w:val="515151"/>
+                <w:sz w:val="20"/>
+              </w:rPr>
+              <w:t>Falha de autenticação Oracle (credenciais expiradas ou API indisponível) deixa todos os GCs desatualizados silenciosamente. sync_status_hs registra o erro mas não há alerta automático confirmado (ver PV-05).</w:t>
+            </w:r>
+          </w:p>
+        </w:tc>
+      </w:tr>
+    </w:tbl>
+    <w:p/>
     <w:p>
       <w:r>
         <w:rPr>
@@ -6652,7 +9383,66 @@
                 <w:color w:val="515151"/>
                 <w:sz w:val="20"/>
               </w:rPr>
-              <w:t>Ponto a validar. Pode haver middleware externo (não HubSpot) responsável pela sync em produção.</w:t>
+              <w:t>Ponto a validar. Pode haver middleware externo (não HubSpot) responsável pela sync em produção. Ver PV-01.</w:t>
+            </w:r>
+          </w:p>
+        </w:tc>
+      </w:tr>
+      <w:tr>
+        <w:trPr>
+          <w:cantSplit/>
+        </w:trPr>
+        <w:tc>
+          <w:tcPr>
+            <w:tcW w:type="dxa" w:w="3118"/>
+            <w:shd w:val="clear" w:color="auto" w:fill="F5F5F5"/>
+            <w:vAlign w:val="center"/>
+          </w:tcPr>
+          <w:p>
+            <w:r>
+              <w:rPr>
+                <w:rFonts w:ascii="Lato" w:hAnsi="Lato"/>
+                <w:b w:val="0"/>
+                <w:color w:val="515151"/>
+                <w:sz w:val="20"/>
+              </w:rPr>
+              <w:t>Divergência entre documento de orientação e implementação real</w:t>
+            </w:r>
+          </w:p>
+        </w:tc>
+        <w:tc>
+          <w:tcPr>
+            <w:tcW w:type="dxa" w:w="2835"/>
+            <w:shd w:val="clear" w:color="auto" w:fill="F5F5F5"/>
+            <w:vAlign w:val="center"/>
+          </w:tcPr>
+          <w:p>
+            <w:r>
+              <w:rPr>
+                <w:rFonts w:ascii="Lato" w:hAnsi="Lato"/>
+                <w:b w:val="0"/>
+                <w:color w:val="515151"/>
+                <w:sz w:val="20"/>
+              </w:rPr>
+              <w:t>O documento 'Orientações integração Oracle → HubSpot' (drive/) previa sincronização incremental (não delete-all global). A implementação confirmada no HubSpot usa delete-all + recreate a cada execução. Não é erro — é decisão de implementação adotada para reduzir complexidade de reconciliação.</w:t>
+            </w:r>
+          </w:p>
+        </w:tc>
+        <w:tc>
+          <w:tcPr>
+            <w:tcW w:type="dxa" w:w="3969"/>
+            <w:shd w:val="clear" w:color="auto" w:fill="F5F5F5"/>
+            <w:vAlign w:val="center"/>
+          </w:tcPr>
+          <w:p>
+            <w:r>
+              <w:rPr>
+                <w:rFonts w:ascii="Lato" w:hAnsi="Lato"/>
+                <w:b w:val="0"/>
+                <w:color w:val="515151"/>
+                <w:sz w:val="20"/>
+              </w:rPr>
+              <w:t>Documentado aqui. O HubSpot é a fonte de verdade. O documento de orientação original está desatualizado neste ponto.</w:t>
             </w:r>
           </w:p>
         </w:tc>
@@ -7214,6 +10004,65 @@
           </w:p>
         </w:tc>
       </w:tr>
+      <w:tr>
+        <w:trPr>
+          <w:cantSplit/>
+        </w:trPr>
+        <w:tc>
+          <w:tcPr>
+            <w:tcW w:type="dxa" w:w="1701"/>
+            <w:shd w:val="clear" w:color="auto" w:fill="FFFFFF"/>
+            <w:vAlign w:val="center"/>
+          </w:tcPr>
+          <w:p>
+            <w:r>
+              <w:rPr>
+                <w:rFonts w:ascii="Lato" w:hAnsi="Lato"/>
+                <w:b w:val="0"/>
+                <w:color w:val="515151"/>
+                <w:sz w:val="20"/>
+              </w:rPr>
+              <w:t>Workflow HubSpot</w:t>
+            </w:r>
+          </w:p>
+        </w:tc>
+        <w:tc>
+          <w:tcPr>
+            <w:tcW w:type="dxa" w:w="4535"/>
+            <w:shd w:val="clear" w:color="auto" w:fill="FFFFFF"/>
+            <w:vAlign w:val="center"/>
+          </w:tcPr>
+          <w:p>
+            <w:r>
+              <w:rPr>
+                <w:rFonts w:ascii="Lato" w:hAnsi="Lato"/>
+                <w:b w:val="0"/>
+                <w:color w:val="515151"/>
+                <w:sz w:val="20"/>
+              </w:rPr>
+              <w:t>[03.01 - Portfólio] Item de linha = Atualizado → Atualiza Portfólio (desabilitado)</w:t>
+            </w:r>
+          </w:p>
+        </w:tc>
+        <w:tc>
+          <w:tcPr>
+            <w:tcW w:type="dxa" w:w="3685"/>
+            <w:shd w:val="clear" w:color="auto" w:fill="FFFFFF"/>
+            <w:vAlign w:val="center"/>
+          </w:tcPr>
+          <w:p>
+            <w:r>
+              <w:rPr>
+                <w:rFonts w:ascii="Lato" w:hAnsi="Lato"/>
+                <w:b w:val="0"/>
+                <w:color w:val="515151"/>
+                <w:sz w:val="20"/>
+              </w:rPr>
+              <w:t>HubSpot Portal 50102745 — id 1769611663</w:t>
+            </w:r>
+          </w:p>
+        </w:tc>
+      </w:tr>
     </w:tbl>
     <w:p/>
     <w:p>
@@ -7385,7 +10234,7 @@
                 <w:color w:val="515151"/>
                 <w:sz w:val="20"/>
               </w:rPr>
-              <w:t>Mecanismo real de sync em produção</w:t>
+              <w:t>Mecanismo real de sync em produção (CRÍTICO)</w:t>
             </w:r>
           </w:p>
         </w:tc>
@@ -7403,7 +10252,7 @@
                 <w:color w:val="515151"/>
                 <w:sz w:val="20"/>
               </w:rPr>
-              <w:t>O workflow [DEV] Integração Oracle (id 1758086000) está com enrollment em um único GC específico (id 45054877487). Como ocorre a atualização das propriedades prog_qtd_* nos demais Grupos de Contrato em produção? Existe middleware externo? Há outro workflow não mapeado?</w:t>
+              <w:t>O workflow [DEV] Integração Oracle (id 1758086000) está configurado com enrollment em 1 único GC de desenvolvimento (id 45054877487). O mecanismo que atualiza as propriedades prog_qtd_* em todos os demais Grupos de Contrato em produção não foi identificado durante as consultas ao HubSpot. Hipóteses: (a) middleware externo ao HubSpot não visível via MCP; (b) workflow adicional não encontrado; (c) sistema externo que chama o workflow por GC individualmente. Requer confirmação de Vinicius Vanoni antes da publicação deste documento.</w:t>
             </w:r>
           </w:p>
         </w:tc>
@@ -7640,6 +10489,124 @@
                 <w:sz w:val="20"/>
               </w:rPr>
               <w:t>Quando a autenticação Oracle falha ou a API retorna erro, existe algum alerta automático (e-mail, Slack, HubSpot notification)? Ou a detecção depende de monitoramento manual do campo sync_status_hs?</w:t>
+            </w:r>
+          </w:p>
+        </w:tc>
+      </w:tr>
+      <w:tr>
+        <w:trPr>
+          <w:cantSplit/>
+        </w:trPr>
+        <w:tc>
+          <w:tcPr>
+            <w:tcW w:type="dxa" w:w="850"/>
+            <w:shd w:val="clear" w:color="auto" w:fill="F5F5F5"/>
+            <w:vAlign w:val="center"/>
+          </w:tcPr>
+          <w:p>
+            <w:r>
+              <w:rPr>
+                <w:rFonts w:ascii="Lato" w:hAnsi="Lato"/>
+                <w:b w:val="0"/>
+                <w:color w:val="515151"/>
+                <w:sz w:val="20"/>
+              </w:rPr>
+              <w:t>PV-06</w:t>
+            </w:r>
+          </w:p>
+        </w:tc>
+        <w:tc>
+          <w:tcPr>
+            <w:tcW w:type="dxa" w:w="2551"/>
+            <w:shd w:val="clear" w:color="auto" w:fill="F5F5F5"/>
+            <w:vAlign w:val="center"/>
+          </w:tcPr>
+          <w:p>
+            <w:r>
+              <w:rPr>
+                <w:rFonts w:ascii="Lato" w:hAnsi="Lato"/>
+                <w:b w:val="0"/>
+                <w:color w:val="515151"/>
+                <w:sz w:val="20"/>
+              </w:rPr>
+              <w:t>Anuentes — relação com integração Oracle</w:t>
+            </w:r>
+          </w:p>
+        </w:tc>
+        <w:tc>
+          <w:tcPr>
+            <w:tcW w:type="dxa" w:w="6520"/>
+            <w:shd w:val="clear" w:color="auto" w:fill="F5F5F5"/>
+            <w:vAlign w:val="center"/>
+          </w:tcPr>
+          <w:p>
+            <w:r>
+              <w:rPr>
+                <w:rFonts w:ascii="Lato" w:hAnsi="Lato"/>
+                <w:b w:val="0"/>
+                <w:color w:val="515151"/>
+                <w:sz w:val="20"/>
+              </w:rPr>
+              <w:t>O tema 'anuentes' aparece em 3 tarefas das 46 do processo 8.1 no ClickUp (86babq5xx — distribuição de percentuais; 86ba4my8a — visualização de vínculos; 86b9wktxz — ajuste HubDB). Nenhuma tarefa conecta anuentes à integração Oracle (sync de prog_qtd_*, autenticação, mapeamento de contratos). Não foi identificado impacto direto na integração Oracle. Requer confirmação de Vinicius Vanoni se há propriedades de anuentes sendo sincronizadas do Oracle para o HubSpot.</w:t>
+            </w:r>
+          </w:p>
+        </w:tc>
+      </w:tr>
+      <w:tr>
+        <w:trPr>
+          <w:cantSplit/>
+        </w:trPr>
+        <w:tc>
+          <w:tcPr>
+            <w:tcW w:type="dxa" w:w="850"/>
+            <w:shd w:val="clear" w:color="auto" w:fill="FFFFFF"/>
+            <w:vAlign w:val="center"/>
+          </w:tcPr>
+          <w:p>
+            <w:r>
+              <w:rPr>
+                <w:rFonts w:ascii="Lato" w:hAnsi="Lato"/>
+                <w:b w:val="0"/>
+                <w:color w:val="515151"/>
+                <w:sz w:val="20"/>
+              </w:rPr>
+              <w:t>PV-07</w:t>
+            </w:r>
+          </w:p>
+        </w:tc>
+        <w:tc>
+          <w:tcPr>
+            <w:tcW w:type="dxa" w:w="2551"/>
+            <w:shd w:val="clear" w:color="auto" w:fill="FFFFFF"/>
+            <w:vAlign w:val="center"/>
+          </w:tcPr>
+          <w:p>
+            <w:r>
+              <w:rPr>
+                <w:rFonts w:ascii="Lato" w:hAnsi="Lato"/>
+                <w:b w:val="0"/>
+                <w:color w:val="515151"/>
+                <w:sz w:val="20"/>
+              </w:rPr>
+              <w:t>Workflow [03.01 - Portfólio] desabilitado — GC→Portfólio sync ativo?</w:t>
+            </w:r>
+          </w:p>
+        </w:tc>
+        <w:tc>
+          <w:tcPr>
+            <w:tcW w:type="dxa" w:w="6520"/>
+            <w:shd w:val="clear" w:color="auto" w:fill="FFFFFF"/>
+            <w:vAlign w:val="center"/>
+          </w:tcPr>
+          <w:p>
+            <w:r>
+              <w:rPr>
+                <w:rFonts w:ascii="Lato" w:hAnsi="Lato"/>
+                <w:b w:val="0"/>
+                <w:color w:val="515151"/>
+                <w:sz w:val="20"/>
+              </w:rPr>
+              <w:t>O workflow [03.01 - Portfólio] Item de linha = Atualizado → Atualiza Portfólio (id 1769611663, objeto GC) está desabilitado no HubSpot. Este era o mecanismo que propagava alterações de itens de linha do GC para o Portfólio após cada sync Oracle. Os workflows [04.01] e [04.02] (objeto Portfólio, ativos) respondem a eventos de itens de linha no Portfólio. Confirmar com Vinicius Vanoni: (a) o [03.01] foi substituído por outro mecanismo? (b) os itens de linha do GC estão sendo propagados para o Portfólio por alguma outra rota? (c) ou o Portfólio está atualmente sem atualização automática após sync Oracle?</w:t>
             </w:r>
           </w:p>
         </w:tc>
@@ -7671,7 +10638,7 @@
         <w:color w:val="9C9B9B"/>
         <w:sz w:val="16"/>
       </w:rPr>
-      <w:t>Uso interno  ·  Nexforce Services  ·  v1.0</w:t>
+      <w:t>Uso interno  ·  Nexforce Services  ·  v2.0</w:t>
     </w:r>
   </w:p>
 </w:ftr>

</xml_diff>